<commit_message>
Update mortality Excel workflow files
</commit_message>
<xml_diff>
--- a/Phase1_Hands_On/Excel/Mortality Table Project Workflow.docx
+++ b/Phase1_Hands_On/Excel/Mortality Table Project Workflow.docx
@@ -11063,6 +11063,7 @@
       </w:pPr>
       <w:r>
         <w:rPr>
+          <w:noProof/>
           <w:sz w:val="28"/>
           <w:szCs w:val="28"/>
         </w:rPr>
@@ -11142,6 +11143,7 @@
       </w:pPr>
       <w:r>
         <w:rPr>
+          <w:noProof/>
           <w:sz w:val="28"/>
           <w:szCs w:val="28"/>
         </w:rPr>
@@ -11209,14 +11211,7 @@
           <w:sz w:val="28"/>
           <w:szCs w:val="28"/>
         </w:rPr>
-        <w:t xml:space="preserve">our objective function </w:t>
-      </w:r>
-      <w:r>
-        <w:rPr>
-          <w:sz w:val="28"/>
-          <w:szCs w:val="28"/>
-        </w:rPr>
-        <w:t>RSS + lambda*2</w:t>
+        <w:t>our objective function RSS + lambda*2</w:t>
       </w:r>
       <w:r>
         <w:rPr>
@@ -11231,25 +11226,19 @@
           <w:sz w:val="28"/>
           <w:szCs w:val="28"/>
         </w:rPr>
-        <w:t>_diff^2</w:t>
-      </w:r>
-      <w:r>
-        <w:rPr>
-          <w:sz w:val="28"/>
-          <w:szCs w:val="28"/>
-        </w:rPr>
-        <w:t xml:space="preserve"> use formula below</w:t>
-      </w:r>
-    </w:p>
-    <w:p>
-      <w:pPr>
-        <w:rPr>
-          <w:sz w:val="28"/>
-          <w:szCs w:val="28"/>
-        </w:rPr>
-      </w:pPr>
-      <w:r>
-        <w:rPr>
+        <w:t>_diff^2 use formula below</w:t>
+      </w:r>
+    </w:p>
+    <w:p>
+      <w:pPr>
+        <w:rPr>
+          <w:sz w:val="28"/>
+          <w:szCs w:val="28"/>
+        </w:rPr>
+      </w:pPr>
+      <w:r>
+        <w:rPr>
+          <w:noProof/>
           <w:sz w:val="28"/>
           <w:szCs w:val="28"/>
         </w:rPr>
@@ -11344,6 +11333,7 @@
       </w:pPr>
       <w:r>
         <w:rPr>
+          <w:noProof/>
           <w:sz w:val="28"/>
           <w:szCs w:val="28"/>
         </w:rPr>
@@ -11451,6 +11441,7 @@
       </w:pPr>
       <w:r>
         <w:rPr>
+          <w:noProof/>
           <w:sz w:val="28"/>
           <w:szCs w:val="28"/>
         </w:rPr>
@@ -11500,6 +11491,7 @@
       </w:pPr>
       <w:r>
         <w:rPr>
+          <w:noProof/>
           <w:sz w:val="28"/>
           <w:szCs w:val="28"/>
         </w:rPr>
@@ -11587,6 +11579,7 @@
       </w:pPr>
       <w:r>
         <w:rPr>
+          <w:noProof/>
           <w:sz w:val="28"/>
           <w:szCs w:val="28"/>
         </w:rPr>
@@ -11821,6 +11814,7 @@
       </w:pPr>
       <w:r>
         <w:rPr>
+          <w:noProof/>
           <w:sz w:val="28"/>
           <w:szCs w:val="28"/>
         </w:rPr>
@@ -11937,6 +11931,7 @@
       </w:pPr>
       <w:r>
         <w:rPr>
+          <w:noProof/>
           <w:sz w:val="28"/>
           <w:szCs w:val="28"/>
         </w:rPr>
@@ -11986,6 +11981,7 @@
       </w:pPr>
       <w:r>
         <w:rPr>
+          <w:noProof/>
           <w:sz w:val="28"/>
           <w:szCs w:val="28"/>
         </w:rPr>
@@ -12053,6 +12049,3500 @@
           <w:szCs w:val="28"/>
         </w:rPr>
         <w:t xml:space="preserve"> effectively smoothing the mortality curve.</w:t>
+      </w:r>
+    </w:p>
+    <w:p>
+      <w:pPr>
+        <w:rPr>
+          <w:sz w:val="28"/>
+          <w:szCs w:val="28"/>
+        </w:rPr>
+      </w:pPr>
+    </w:p>
+    <w:p>
+      <w:pPr>
+        <w:rPr>
+          <w:sz w:val="28"/>
+          <w:szCs w:val="28"/>
+        </w:rPr>
+      </w:pPr>
+      <w:r>
+        <w:rPr>
+          <w:sz w:val="28"/>
+          <w:szCs w:val="28"/>
+        </w:rPr>
+        <w:t xml:space="preserve">5.) </w:t>
+      </w:r>
+      <w:r>
+        <w:rPr>
+          <w:sz w:val="28"/>
+          <w:szCs w:val="28"/>
+        </w:rPr>
+        <w:t>Final Model</w:t>
+      </w:r>
+    </w:p>
+    <w:p>
+      <w:pPr>
+        <w:rPr>
+          <w:sz w:val="28"/>
+          <w:szCs w:val="28"/>
+        </w:rPr>
+      </w:pPr>
+    </w:p>
+    <w:p>
+      <w:pPr>
+        <w:rPr>
+          <w:sz w:val="28"/>
+          <w:szCs w:val="28"/>
+        </w:rPr>
+      </w:pPr>
+      <w:r>
+        <w:rPr>
+          <w:sz w:val="28"/>
+          <w:szCs w:val="28"/>
+        </w:rPr>
+        <w:t xml:space="preserve">For the final </w:t>
+      </w:r>
+      <w:r>
+        <w:rPr>
+          <w:sz w:val="28"/>
+          <w:szCs w:val="28"/>
+        </w:rPr>
+        <w:t>model we will be using the most industry standard model that accounts for yearly changes in</w:t>
+      </w:r>
+      <w:r>
+        <w:rPr>
+          <w:sz w:val="28"/>
+          <w:szCs w:val="28"/>
+        </w:rPr>
+        <w:t xml:space="preserve"> mortality.</w:t>
+      </w:r>
+    </w:p>
+    <w:p>
+      <w:pPr>
+        <w:rPr>
+          <w:sz w:val="28"/>
+          <w:szCs w:val="28"/>
+        </w:rPr>
+      </w:pPr>
+    </w:p>
+    <w:p>
+      <w:pPr>
+        <w:rPr>
+          <w:i/>
+          <w:iCs/>
+          <w:sz w:val="28"/>
+          <w:szCs w:val="28"/>
+        </w:rPr>
+      </w:pPr>
+      <w:r>
+        <w:rPr>
+          <w:i/>
+          <w:iCs/>
+          <w:sz w:val="28"/>
+          <w:szCs w:val="28"/>
+        </w:rPr>
+        <w:t>Lee-Carter</w:t>
+      </w:r>
+      <w:r>
+        <w:rPr>
+          <w:i/>
+          <w:iCs/>
+          <w:sz w:val="28"/>
+          <w:szCs w:val="28"/>
+        </w:rPr>
+        <w:t xml:space="preserve"> Model</w:t>
+      </w:r>
+    </w:p>
+    <w:p>
+      <w:pPr>
+        <w:rPr>
+          <w:sz w:val="28"/>
+          <w:szCs w:val="28"/>
+        </w:rPr>
+      </w:pPr>
+      <w:r>
+        <w:rPr>
+          <w:sz w:val="28"/>
+          <w:szCs w:val="28"/>
+        </w:rPr>
+        <w:lastRenderedPageBreak/>
+        <w:t xml:space="preserve">Lee-Carter </w:t>
+      </w:r>
+      <w:r>
+        <w:rPr>
+          <w:sz w:val="28"/>
+          <w:szCs w:val="28"/>
+        </w:rPr>
+        <w:t>essentially p</w:t>
+      </w:r>
+      <w:r>
+        <w:rPr>
+          <w:sz w:val="28"/>
+          <w:szCs w:val="28"/>
+        </w:rPr>
+        <w:t xml:space="preserve">roposed that mortality grows exponentially with age but across </w:t>
+      </w:r>
+      <w:r>
+        <w:rPr>
+          <w:sz w:val="28"/>
+          <w:szCs w:val="28"/>
+        </w:rPr>
+        <w:t xml:space="preserve">each year it can vary due to certain shocks like improvements in medicine, wars, disease, etc. </w:t>
+      </w:r>
+      <w:r>
+        <w:rPr>
+          <w:sz w:val="28"/>
+          <w:szCs w:val="28"/>
+        </w:rPr>
+        <w:t>The model is essentially an age level</w:t>
+      </w:r>
+      <w:r>
+        <w:rPr>
+          <w:sz w:val="28"/>
+          <w:szCs w:val="28"/>
+        </w:rPr>
+        <w:t xml:space="preserve">-removed (ANOVA) </w:t>
+      </w:r>
+      <w:r>
+        <w:rPr>
+          <w:sz w:val="28"/>
+          <w:szCs w:val="28"/>
+        </w:rPr>
+        <w:t xml:space="preserve">rank 1 factor analysis using PC1 of the </w:t>
+      </w:r>
+      <w:r>
+        <w:rPr>
+          <w:sz w:val="28"/>
+          <w:szCs w:val="28"/>
+        </w:rPr>
+        <w:t xml:space="preserve">covariance matrix of years. Then a time series modeling process can be fit on the </w:t>
+      </w:r>
+      <w:r>
+        <w:rPr>
+          <w:sz w:val="28"/>
+          <w:szCs w:val="28"/>
+        </w:rPr>
+        <w:t>reduced factors.</w:t>
+      </w:r>
+    </w:p>
+    <w:p>
+      <w:pPr>
+        <w:rPr>
+          <w:sz w:val="28"/>
+          <w:szCs w:val="28"/>
+        </w:rPr>
+      </w:pPr>
+    </w:p>
+    <w:p>
+      <w:pPr>
+        <w:rPr>
+          <w:sz w:val="28"/>
+          <w:szCs w:val="28"/>
+          <w:lang w:val="fr-FR"/>
+        </w:rPr>
+      </w:pPr>
+      <w:r>
+        <w:rPr>
+          <w:sz w:val="28"/>
+          <w:szCs w:val="28"/>
+          <w:lang w:val="fr-FR"/>
+        </w:rPr>
+        <w:t>Model Statement: ln(mx)</w:t>
+      </w:r>
+      <w:r>
+        <w:rPr>
+          <w:sz w:val="28"/>
+          <w:szCs w:val="28"/>
+          <w:lang w:val="fr-FR"/>
+        </w:rPr>
+        <w:t xml:space="preserve"> = a(x) + b(x)k(t)</w:t>
+      </w:r>
+      <w:r>
+        <w:rPr>
+          <w:sz w:val="28"/>
+          <w:szCs w:val="28"/>
+          <w:lang w:val="fr-FR"/>
+        </w:rPr>
+        <w:t xml:space="preserve"> + </w:t>
+      </w:r>
+      <w:r>
+        <w:rPr>
+          <w:sz w:val="28"/>
+          <w:szCs w:val="28"/>
+          <w:lang w:val="fr-FR"/>
+        </w:rPr>
+        <w:t>e(x,t</w:t>
+      </w:r>
+      <w:r>
+        <w:rPr>
+          <w:sz w:val="28"/>
+          <w:szCs w:val="28"/>
+          <w:lang w:val="fr-FR"/>
+        </w:rPr>
+        <w:t>)</w:t>
+      </w:r>
+    </w:p>
+    <w:p>
+      <w:pPr>
+        <w:rPr>
+          <w:sz w:val="28"/>
+          <w:szCs w:val="28"/>
+        </w:rPr>
+      </w:pPr>
+      <w:r>
+        <w:rPr>
+          <w:sz w:val="28"/>
+          <w:szCs w:val="28"/>
+        </w:rPr>
+        <w:t xml:space="preserve">Assumptions: </w:t>
+      </w:r>
+      <w:r>
+        <w:rPr>
+          <w:sz w:val="28"/>
+          <w:szCs w:val="28"/>
+        </w:rPr>
+        <w:t>[</w:t>
+      </w:r>
+      <w:r>
+        <w:rPr>
+          <w:sz w:val="28"/>
+          <w:szCs w:val="28"/>
+        </w:rPr>
+        <w:t>a(x): Age l</w:t>
+      </w:r>
+      <w:r>
+        <w:rPr>
+          <w:sz w:val="28"/>
+          <w:szCs w:val="28"/>
+        </w:rPr>
+        <w:t>evel means</w:t>
+      </w:r>
+      <w:r>
+        <w:rPr>
+          <w:sz w:val="28"/>
+          <w:szCs w:val="28"/>
+        </w:rPr>
+        <w:t>], [b</w:t>
+      </w:r>
+      <w:r>
+        <w:rPr>
+          <w:sz w:val="28"/>
+          <w:szCs w:val="28"/>
+        </w:rPr>
+        <w:t xml:space="preserve">(x): </w:t>
+      </w:r>
+      <w:r>
+        <w:rPr>
+          <w:sz w:val="28"/>
+          <w:szCs w:val="28"/>
+        </w:rPr>
+        <w:t>Age sensitivity</w:t>
+      </w:r>
+      <w:r>
+        <w:rPr>
+          <w:sz w:val="28"/>
+          <w:szCs w:val="28"/>
+        </w:rPr>
+        <w:t>]</w:t>
+      </w:r>
+      <w:r>
+        <w:rPr>
+          <w:sz w:val="28"/>
+          <w:szCs w:val="28"/>
+        </w:rPr>
+        <w:t>, [k</w:t>
+      </w:r>
+      <w:r>
+        <w:rPr>
+          <w:sz w:val="28"/>
+          <w:szCs w:val="28"/>
+        </w:rPr>
+        <w:t>(</w:t>
+      </w:r>
+      <w:r>
+        <w:rPr>
+          <w:sz w:val="28"/>
+          <w:szCs w:val="28"/>
+        </w:rPr>
+        <w:t>t</w:t>
+      </w:r>
+      <w:r>
+        <w:rPr>
+          <w:sz w:val="28"/>
+          <w:szCs w:val="28"/>
+        </w:rPr>
+        <w:t>):</w:t>
+      </w:r>
+      <w:r>
+        <w:rPr>
+          <w:sz w:val="28"/>
+          <w:szCs w:val="28"/>
+        </w:rPr>
+        <w:t xml:space="preserve">Mortality Index], </w:t>
+      </w:r>
+      <w:r>
+        <w:rPr>
+          <w:sz w:val="28"/>
+          <w:szCs w:val="28"/>
+        </w:rPr>
+        <w:t>[e</w:t>
+      </w:r>
+      <w:r>
+        <w:rPr>
+          <w:sz w:val="28"/>
+          <w:szCs w:val="28"/>
+        </w:rPr>
+        <w:t>(x</w:t>
+      </w:r>
+      <w:r>
+        <w:rPr>
+          <w:sz w:val="28"/>
+          <w:szCs w:val="28"/>
+        </w:rPr>
+        <w:t>,t</w:t>
+      </w:r>
+      <w:r>
+        <w:rPr>
+          <w:sz w:val="28"/>
+          <w:szCs w:val="28"/>
+        </w:rPr>
+        <w:t xml:space="preserve">): </w:t>
+      </w:r>
+      <w:r>
+        <w:rPr>
+          <w:sz w:val="28"/>
+          <w:szCs w:val="28"/>
+        </w:rPr>
+        <w:t>error</w:t>
+      </w:r>
+      <w:r>
+        <w:rPr>
+          <w:sz w:val="28"/>
+          <w:szCs w:val="28"/>
+        </w:rPr>
+        <w:t xml:space="preserve"> dist. iid N(0,</w:t>
+      </w:r>
+      <w:r>
+        <w:rPr>
+          <w:sz w:val="28"/>
+          <w:szCs w:val="28"/>
+        </w:rPr>
+        <w:t>sigma(e)^2)</w:t>
+      </w:r>
+      <w:r>
+        <w:rPr>
+          <w:sz w:val="28"/>
+          <w:szCs w:val="28"/>
+        </w:rPr>
+        <w:t>]</w:t>
+      </w:r>
+    </w:p>
+    <w:p>
+      <w:pPr>
+        <w:rPr>
+          <w:sz w:val="28"/>
+          <w:szCs w:val="28"/>
+        </w:rPr>
+      </w:pPr>
+    </w:p>
+    <w:p>
+      <w:pPr>
+        <w:rPr>
+          <w:sz w:val="28"/>
+          <w:szCs w:val="28"/>
+        </w:rPr>
+      </w:pPr>
+      <w:r>
+        <w:rPr>
+          <w:sz w:val="28"/>
+          <w:szCs w:val="28"/>
+        </w:rPr>
+        <w:t>Load moralities for each year from the improvement pivot table.</w:t>
+      </w:r>
+    </w:p>
+    <w:p>
+      <w:pPr>
+        <w:rPr>
+          <w:sz w:val="28"/>
+          <w:szCs w:val="28"/>
+        </w:rPr>
+      </w:pPr>
+      <w:r>
+        <w:rPr>
+          <w:noProof/>
+          <w:sz w:val="28"/>
+          <w:szCs w:val="28"/>
+        </w:rPr>
+        <w:drawing>
+          <wp:inline distT="0" distB="0" distL="0" distR="0" wp14:anchorId="367ADE9C" wp14:editId="22BAE815">
+            <wp:extent cx="4305673" cy="1684166"/>
+            <wp:effectExtent l="0" t="0" r="0" b="0"/>
+            <wp:docPr id="237190974" name="Picture 1"/>
+            <wp:cNvGraphicFramePr>
+              <a:graphicFrameLocks xmlns:a="http://schemas.openxmlformats.org/drawingml/2006/main" noChangeAspect="1"/>
+            </wp:cNvGraphicFramePr>
+            <a:graphic xmlns:a="http://schemas.openxmlformats.org/drawingml/2006/main">
+              <a:graphicData uri="http://schemas.openxmlformats.org/drawingml/2006/picture">
+                <pic:pic xmlns:pic="http://schemas.openxmlformats.org/drawingml/2006/picture">
+                  <pic:nvPicPr>
+                    <pic:cNvPr id="237190974" name=""/>
+                    <pic:cNvPicPr/>
+                  </pic:nvPicPr>
+                  <pic:blipFill>
+                    <a:blip r:embed="rId116"/>
+                    <a:stretch>
+                      <a:fillRect/>
+                    </a:stretch>
+                  </pic:blipFill>
+                  <pic:spPr>
+                    <a:xfrm>
+                      <a:off x="0" y="0"/>
+                      <a:ext cx="4305673" cy="1684166"/>
+                    </a:xfrm>
+                    <a:prstGeom prst="rect">
+                      <a:avLst/>
+                    </a:prstGeom>
+                  </pic:spPr>
+                </pic:pic>
+              </a:graphicData>
+            </a:graphic>
+          </wp:inline>
+        </w:drawing>
+      </w:r>
+    </w:p>
+    <w:p>
+      <w:pPr>
+        <w:rPr>
+          <w:sz w:val="28"/>
+          <w:szCs w:val="28"/>
+        </w:rPr>
+      </w:pPr>
+    </w:p>
+    <w:p>
+      <w:pPr>
+        <w:rPr>
+          <w:sz w:val="28"/>
+          <w:szCs w:val="28"/>
+        </w:rPr>
+      </w:pPr>
+      <w:r>
+        <w:rPr>
+          <w:sz w:val="28"/>
+          <w:szCs w:val="28"/>
+        </w:rPr>
+        <w:t>Take LN of each column</w:t>
+      </w:r>
+      <w:r>
+        <w:rPr>
+          <w:sz w:val="28"/>
+          <w:szCs w:val="28"/>
+        </w:rPr>
+        <w:t xml:space="preserve">, remove original mortality columns </w:t>
+      </w:r>
+      <w:r>
+        <w:rPr>
+          <w:sz w:val="28"/>
+          <w:szCs w:val="28"/>
+        </w:rPr>
+        <w:t xml:space="preserve">and </w:t>
+      </w:r>
+      <w:r>
+        <w:rPr>
+          <w:sz w:val="28"/>
+          <w:szCs w:val="28"/>
+        </w:rPr>
+        <w:t xml:space="preserve">take </w:t>
+      </w:r>
+      <w:r>
+        <w:rPr>
+          <w:sz w:val="28"/>
+          <w:szCs w:val="28"/>
+        </w:rPr>
+        <w:t>average</w:t>
+      </w:r>
+      <w:r>
+        <w:rPr>
+          <w:sz w:val="28"/>
+          <w:szCs w:val="28"/>
+        </w:rPr>
+        <w:t xml:space="preserve">s </w:t>
+      </w:r>
+      <w:r>
+        <w:rPr>
+          <w:sz w:val="28"/>
+          <w:szCs w:val="28"/>
+        </w:rPr>
+        <w:t>of each</w:t>
+      </w:r>
+      <w:r>
+        <w:rPr>
+          <w:sz w:val="28"/>
+          <w:szCs w:val="28"/>
+        </w:rPr>
+        <w:t xml:space="preserve"> log transformed</w:t>
+      </w:r>
+      <w:r>
+        <w:rPr>
+          <w:sz w:val="28"/>
+          <w:szCs w:val="28"/>
+        </w:rPr>
+        <w:t xml:space="preserve"> row</w:t>
+      </w:r>
+    </w:p>
+    <w:p>
+      <w:pPr>
+        <w:rPr>
+          <w:sz w:val="28"/>
+          <w:szCs w:val="28"/>
+        </w:rPr>
+      </w:pPr>
+      <w:r>
+        <w:rPr>
+          <w:noProof/>
+          <w:sz w:val="28"/>
+          <w:szCs w:val="28"/>
+        </w:rPr>
+        <w:drawing>
+          <wp:inline distT="0" distB="0" distL="0" distR="0" wp14:anchorId="5CC85BDF" wp14:editId="0D795F9E">
+            <wp:extent cx="4976291" cy="1082134"/>
+            <wp:effectExtent l="0" t="0" r="0" b="3810"/>
+            <wp:docPr id="1618802670" name="Picture 1"/>
+            <wp:cNvGraphicFramePr>
+              <a:graphicFrameLocks xmlns:a="http://schemas.openxmlformats.org/drawingml/2006/main" noChangeAspect="1"/>
+            </wp:cNvGraphicFramePr>
+            <a:graphic xmlns:a="http://schemas.openxmlformats.org/drawingml/2006/main">
+              <a:graphicData uri="http://schemas.openxmlformats.org/drawingml/2006/picture">
+                <pic:pic xmlns:pic="http://schemas.openxmlformats.org/drawingml/2006/picture">
+                  <pic:nvPicPr>
+                    <pic:cNvPr id="1618802670" name=""/>
+                    <pic:cNvPicPr/>
+                  </pic:nvPicPr>
+                  <pic:blipFill>
+                    <a:blip r:embed="rId117"/>
+                    <a:stretch>
+                      <a:fillRect/>
+                    </a:stretch>
+                  </pic:blipFill>
+                  <pic:spPr>
+                    <a:xfrm>
+                      <a:off x="0" y="0"/>
+                      <a:ext cx="4976291" cy="1082134"/>
+                    </a:xfrm>
+                    <a:prstGeom prst="rect">
+                      <a:avLst/>
+                    </a:prstGeom>
+                  </pic:spPr>
+                </pic:pic>
+              </a:graphicData>
+            </a:graphic>
+          </wp:inline>
+        </w:drawing>
+      </w:r>
+    </w:p>
+    <w:p>
+      <w:pPr>
+        <w:rPr>
+          <w:sz w:val="28"/>
+          <w:szCs w:val="28"/>
+        </w:rPr>
+      </w:pPr>
+      <w:r>
+        <w:rPr>
+          <w:noProof/>
+          <w:sz w:val="28"/>
+          <w:szCs w:val="28"/>
+        </w:rPr>
+        <w:lastRenderedPageBreak/>
+        <w:drawing>
+          <wp:inline distT="0" distB="0" distL="0" distR="0" wp14:anchorId="6404C45D" wp14:editId="25EE0425">
+            <wp:extent cx="5273497" cy="1806097"/>
+            <wp:effectExtent l="0" t="0" r="3810" b="3810"/>
+            <wp:docPr id="1721906044" name="Picture 1"/>
+            <wp:cNvGraphicFramePr>
+              <a:graphicFrameLocks xmlns:a="http://schemas.openxmlformats.org/drawingml/2006/main" noChangeAspect="1"/>
+            </wp:cNvGraphicFramePr>
+            <a:graphic xmlns:a="http://schemas.openxmlformats.org/drawingml/2006/main">
+              <a:graphicData uri="http://schemas.openxmlformats.org/drawingml/2006/picture">
+                <pic:pic xmlns:pic="http://schemas.openxmlformats.org/drawingml/2006/picture">
+                  <pic:nvPicPr>
+                    <pic:cNvPr id="1721906044" name=""/>
+                    <pic:cNvPicPr/>
+                  </pic:nvPicPr>
+                  <pic:blipFill>
+                    <a:blip r:embed="rId118"/>
+                    <a:stretch>
+                      <a:fillRect/>
+                    </a:stretch>
+                  </pic:blipFill>
+                  <pic:spPr>
+                    <a:xfrm>
+                      <a:off x="0" y="0"/>
+                      <a:ext cx="5273497" cy="1806097"/>
+                    </a:xfrm>
+                    <a:prstGeom prst="rect">
+                      <a:avLst/>
+                    </a:prstGeom>
+                  </pic:spPr>
+                </pic:pic>
+              </a:graphicData>
+            </a:graphic>
+          </wp:inline>
+        </w:drawing>
+      </w:r>
+    </w:p>
+    <w:p>
+      <w:pPr>
+        <w:rPr>
+          <w:sz w:val="28"/>
+          <w:szCs w:val="28"/>
+        </w:rPr>
+      </w:pPr>
+    </w:p>
+    <w:p>
+      <w:pPr>
+        <w:rPr>
+          <w:sz w:val="28"/>
+          <w:szCs w:val="28"/>
+        </w:rPr>
+      </w:pPr>
+      <w:r>
+        <w:rPr>
+          <w:sz w:val="28"/>
+          <w:szCs w:val="28"/>
+        </w:rPr>
+        <w:t>Subtract</w:t>
+      </w:r>
+      <w:r>
+        <w:rPr>
+          <w:sz w:val="28"/>
+          <w:szCs w:val="28"/>
+        </w:rPr>
+        <w:t xml:space="preserve"> age level </w:t>
+      </w:r>
+      <w:r>
+        <w:rPr>
+          <w:sz w:val="28"/>
+          <w:szCs w:val="28"/>
+        </w:rPr>
+        <w:t xml:space="preserve">means from each </w:t>
+      </w:r>
+      <w:r>
+        <w:rPr>
+          <w:sz w:val="28"/>
+          <w:szCs w:val="28"/>
+        </w:rPr>
+        <w:t xml:space="preserve">observation </w:t>
+      </w:r>
+      <w:r>
+        <w:rPr>
+          <w:sz w:val="28"/>
+          <w:szCs w:val="28"/>
+        </w:rPr>
+        <w:t>that model statement equation is</w:t>
+      </w:r>
+      <w:r>
+        <w:rPr>
+          <w:sz w:val="28"/>
+          <w:szCs w:val="28"/>
+        </w:rPr>
+        <w:t xml:space="preserve"> </w:t>
+      </w:r>
+      <w:r>
+        <w:rPr>
+          <w:sz w:val="28"/>
+          <w:szCs w:val="28"/>
+        </w:rPr>
+        <w:t xml:space="preserve">ln(mx) </w:t>
+      </w:r>
+      <w:r>
+        <w:rPr>
+          <w:sz w:val="28"/>
+          <w:szCs w:val="28"/>
+        </w:rPr>
+        <w:t xml:space="preserve">- </w:t>
+      </w:r>
+      <w:r>
+        <w:rPr>
+          <w:sz w:val="28"/>
+          <w:szCs w:val="28"/>
+        </w:rPr>
+        <w:t xml:space="preserve">a(x) </w:t>
+      </w:r>
+      <w:r>
+        <w:rPr>
+          <w:sz w:val="28"/>
+          <w:szCs w:val="28"/>
+        </w:rPr>
+        <w:t xml:space="preserve">= </w:t>
+      </w:r>
+      <w:r>
+        <w:rPr>
+          <w:sz w:val="28"/>
+          <w:szCs w:val="28"/>
+        </w:rPr>
+        <w:t>b(x)k(t) + e(x,t)</w:t>
+      </w:r>
+      <w:r>
+        <w:rPr>
+          <w:sz w:val="28"/>
+          <w:szCs w:val="28"/>
+        </w:rPr>
+        <w:t>.</w:t>
+      </w:r>
+    </w:p>
+    <w:p>
+      <w:pPr>
+        <w:rPr>
+          <w:sz w:val="28"/>
+          <w:szCs w:val="28"/>
+        </w:rPr>
+      </w:pPr>
+      <w:r>
+        <w:rPr>
+          <w:noProof/>
+          <w:sz w:val="28"/>
+          <w:szCs w:val="28"/>
+        </w:rPr>
+        <w:drawing>
+          <wp:inline distT="0" distB="0" distL="0" distR="0" wp14:anchorId="0195B862" wp14:editId="1A149DE1">
+            <wp:extent cx="5943600" cy="1536065"/>
+            <wp:effectExtent l="0" t="0" r="0" b="6985"/>
+            <wp:docPr id="1525666189" name="Picture 1"/>
+            <wp:cNvGraphicFramePr>
+              <a:graphicFrameLocks xmlns:a="http://schemas.openxmlformats.org/drawingml/2006/main" noChangeAspect="1"/>
+            </wp:cNvGraphicFramePr>
+            <a:graphic xmlns:a="http://schemas.openxmlformats.org/drawingml/2006/main">
+              <a:graphicData uri="http://schemas.openxmlformats.org/drawingml/2006/picture">
+                <pic:pic xmlns:pic="http://schemas.openxmlformats.org/drawingml/2006/picture">
+                  <pic:nvPicPr>
+                    <pic:cNvPr id="0" name="Picture 1"/>
+                    <pic:cNvPicPr>
+                      <a:picLocks noChangeAspect="1" noChangeArrowheads="1"/>
+                    </pic:cNvPicPr>
+                  </pic:nvPicPr>
+                  <pic:blipFill>
+                    <a:blip r:embed="rId119">
+                      <a:extLst>
+                        <a:ext uri="{28A0092B-C50C-407E-A947-70E740481C1C}">
+                          <a14:useLocalDpi xmlns:a14="http://schemas.microsoft.com/office/drawing/2010/main" val="0"/>
+                        </a:ext>
+                      </a:extLst>
+                    </a:blip>
+                    <a:srcRect/>
+                    <a:stretch>
+                      <a:fillRect/>
+                    </a:stretch>
+                  </pic:blipFill>
+                  <pic:spPr bwMode="auto">
+                    <a:xfrm>
+                      <a:off x="0" y="0"/>
+                      <a:ext cx="5943600" cy="1536065"/>
+                    </a:xfrm>
+                    <a:prstGeom prst="rect">
+                      <a:avLst/>
+                    </a:prstGeom>
+                    <a:noFill/>
+                    <a:ln>
+                      <a:noFill/>
+                    </a:ln>
+                  </pic:spPr>
+                </pic:pic>
+              </a:graphicData>
+            </a:graphic>
+          </wp:inline>
+        </w:drawing>
+      </w:r>
+    </w:p>
+    <w:p>
+      <w:pPr>
+        <w:rPr>
+          <w:sz w:val="28"/>
+          <w:szCs w:val="28"/>
+        </w:rPr>
+      </w:pPr>
+    </w:p>
+    <w:p>
+      <w:pPr>
+        <w:rPr>
+          <w:sz w:val="28"/>
+          <w:szCs w:val="28"/>
+        </w:rPr>
+      </w:pPr>
+      <w:r>
+        <w:rPr>
+          <w:sz w:val="28"/>
+          <w:szCs w:val="28"/>
+        </w:rPr>
+        <w:t>Originally by the model statement, we will take</w:t>
+      </w:r>
+      <w:r>
+        <w:rPr>
+          <w:sz w:val="28"/>
+          <w:szCs w:val="28"/>
+        </w:rPr>
+        <w:t xml:space="preserve"> the covariance matrix</w:t>
+      </w:r>
+      <w:r>
+        <w:rPr>
+          <w:sz w:val="28"/>
+          <w:szCs w:val="28"/>
+        </w:rPr>
+        <w:t xml:space="preserve"> </w:t>
+      </w:r>
+      <w:r>
+        <w:rPr>
+          <w:sz w:val="28"/>
+          <w:szCs w:val="28"/>
+        </w:rPr>
+        <w:t xml:space="preserve">row-wise </w:t>
+      </w:r>
+      <w:r>
+        <w:rPr>
+          <w:sz w:val="28"/>
+          <w:szCs w:val="28"/>
+        </w:rPr>
+        <w:t xml:space="preserve">and </w:t>
+      </w:r>
+      <w:r>
+        <w:rPr>
+          <w:sz w:val="28"/>
+          <w:szCs w:val="28"/>
+        </w:rPr>
+        <w:t xml:space="preserve">will create 65x65 </w:t>
+      </w:r>
+      <w:r>
+        <w:rPr>
+          <w:sz w:val="28"/>
+          <w:szCs w:val="28"/>
+        </w:rPr>
+        <w:t xml:space="preserve">age by age </w:t>
+      </w:r>
+      <w:r>
+        <w:rPr>
+          <w:sz w:val="28"/>
+          <w:szCs w:val="28"/>
+        </w:rPr>
+        <w:t>matrix</w:t>
+      </w:r>
+      <w:r>
+        <w:rPr>
+          <w:sz w:val="28"/>
+          <w:szCs w:val="28"/>
+        </w:rPr>
+        <w:t>. Then a EVD will be done on the covariance matrix then we will take the</w:t>
+      </w:r>
+      <w:r>
+        <w:rPr>
+          <w:sz w:val="28"/>
+          <w:szCs w:val="28"/>
+        </w:rPr>
+        <w:t xml:space="preserve"> eigenvector with the highest eigenvalue, normalize it so the components add up to 1</w:t>
+      </w:r>
+      <w:r>
+        <w:rPr>
+          <w:sz w:val="28"/>
+          <w:szCs w:val="28"/>
+        </w:rPr>
+        <w:t xml:space="preserve"> to get our b(x) vector. Then we would </w:t>
+      </w:r>
+      <w:r>
+        <w:rPr>
+          <w:sz w:val="28"/>
+          <w:szCs w:val="28"/>
+        </w:rPr>
+        <w:t>use formula k’(t)=</w:t>
+      </w:r>
+      <w:r>
+        <w:rPr>
+          <w:sz w:val="28"/>
+          <w:szCs w:val="28"/>
+        </w:rPr>
+        <w:t>b’</w:t>
+      </w:r>
+      <w:r>
+        <w:rPr>
+          <w:sz w:val="28"/>
+          <w:szCs w:val="28"/>
+        </w:rPr>
+        <w:t>(x)</w:t>
+      </w:r>
+      <w:r>
+        <w:rPr>
+          <w:sz w:val="28"/>
+          <w:szCs w:val="28"/>
+        </w:rPr>
+        <w:t>Z/b’</w:t>
+      </w:r>
+      <w:r>
+        <w:rPr>
+          <w:sz w:val="28"/>
+          <w:szCs w:val="28"/>
+        </w:rPr>
+        <w:t>(x)</w:t>
+      </w:r>
+      <w:r>
+        <w:rPr>
+          <w:sz w:val="28"/>
+          <w:szCs w:val="28"/>
+        </w:rPr>
+        <w:t>b</w:t>
+      </w:r>
+      <w:r>
+        <w:rPr>
+          <w:sz w:val="28"/>
+          <w:szCs w:val="28"/>
+        </w:rPr>
+        <w:t>(x)</w:t>
+      </w:r>
+      <w:r>
+        <w:rPr>
+          <w:sz w:val="28"/>
+          <w:szCs w:val="28"/>
+        </w:rPr>
+        <w:t xml:space="preserve"> to get k</w:t>
+      </w:r>
+      <w:r>
+        <w:rPr>
+          <w:sz w:val="28"/>
+          <w:szCs w:val="28"/>
+        </w:rPr>
+        <w:t>’(t). Multiply k’(t) to our</w:t>
+      </w:r>
+      <w:r>
+        <w:rPr>
+          <w:sz w:val="28"/>
+          <w:szCs w:val="28"/>
+        </w:rPr>
+        <w:t xml:space="preserve"> b(x) which is </w:t>
+      </w:r>
+      <w:r>
+        <w:rPr>
+          <w:sz w:val="28"/>
+          <w:szCs w:val="28"/>
+        </w:rPr>
+        <w:t>b(x)k’(t). Error term is Z-b(x)</w:t>
+      </w:r>
+      <w:r>
+        <w:rPr>
+          <w:sz w:val="28"/>
+          <w:szCs w:val="28"/>
+        </w:rPr>
+        <w:t>k’(t)=e(x,t).</w:t>
+      </w:r>
+    </w:p>
+    <w:p>
+      <w:pPr>
+        <w:rPr>
+          <w:sz w:val="28"/>
+          <w:szCs w:val="28"/>
+        </w:rPr>
+      </w:pPr>
+    </w:p>
+    <w:p>
+      <w:pPr>
+        <w:rPr>
+          <w:sz w:val="28"/>
+          <w:szCs w:val="28"/>
+        </w:rPr>
+      </w:pPr>
+      <w:r>
+        <w:rPr>
+          <w:sz w:val="28"/>
+          <w:szCs w:val="28"/>
+        </w:rPr>
+        <w:t xml:space="preserve">However, in excel this is essentially not optimal. The quickest way to solve this problem is to use the solver to accurately estimate </w:t>
+      </w:r>
+      <w:r>
+        <w:rPr>
+          <w:sz w:val="28"/>
+          <w:szCs w:val="28"/>
+        </w:rPr>
+        <w:t>b’(x) values by optimization algorithms.</w:t>
+      </w:r>
+    </w:p>
+    <w:p>
+      <w:pPr>
+        <w:rPr>
+          <w:sz w:val="28"/>
+          <w:szCs w:val="28"/>
+        </w:rPr>
+      </w:pPr>
+    </w:p>
+    <w:p>
+      <w:pPr>
+        <w:rPr>
+          <w:sz w:val="28"/>
+          <w:szCs w:val="28"/>
+        </w:rPr>
+      </w:pPr>
+      <w:r>
+        <w:rPr>
+          <w:sz w:val="28"/>
+          <w:szCs w:val="28"/>
+        </w:rPr>
+        <w:lastRenderedPageBreak/>
+        <w:t xml:space="preserve">First, create an arbitrary </w:t>
+      </w:r>
+    </w:p>
+    <w:p>
+      <w:pPr>
+        <w:rPr>
+          <w:sz w:val="28"/>
+          <w:szCs w:val="28"/>
+        </w:rPr>
+      </w:pPr>
+    </w:p>
+    <w:p>
+      <w:pPr>
+        <w:rPr>
+          <w:sz w:val="28"/>
+          <w:szCs w:val="28"/>
+        </w:rPr>
+      </w:pPr>
+      <w:r>
+        <w:rPr>
+          <w:sz w:val="28"/>
+          <w:szCs w:val="28"/>
+        </w:rPr>
+        <w:t>Second</w:t>
+      </w:r>
+      <w:r>
+        <w:rPr>
+          <w:sz w:val="28"/>
+          <w:szCs w:val="28"/>
+        </w:rPr>
+        <w:t>,</w:t>
+      </w:r>
+      <w:r>
+        <w:rPr>
+          <w:sz w:val="28"/>
+          <w:szCs w:val="28"/>
+        </w:rPr>
+        <w:t xml:space="preserve"> create </w:t>
+      </w:r>
+      <w:r>
+        <w:rPr>
+          <w:sz w:val="28"/>
+          <w:szCs w:val="28"/>
+        </w:rPr>
+        <w:t xml:space="preserve">error </w:t>
+      </w:r>
+      <w:r>
+        <w:rPr>
+          <w:sz w:val="28"/>
+          <w:szCs w:val="28"/>
+        </w:rPr>
+        <w:t xml:space="preserve">squared </w:t>
+      </w:r>
+      <w:r>
+        <w:rPr>
+          <w:sz w:val="28"/>
+          <w:szCs w:val="28"/>
+        </w:rPr>
+        <w:t xml:space="preserve">matrix </w:t>
+      </w:r>
+      <w:r>
+        <w:rPr>
+          <w:sz w:val="28"/>
+          <w:szCs w:val="28"/>
+        </w:rPr>
+        <w:t>by adding additional columns with these formulas.</w:t>
+      </w:r>
+    </w:p>
+    <w:p>
+      <w:pPr>
+        <w:rPr>
+          <w:sz w:val="28"/>
+          <w:szCs w:val="28"/>
+        </w:rPr>
+      </w:pPr>
+      <w:r>
+        <w:rPr>
+          <w:noProof/>
+          <w:sz w:val="28"/>
+          <w:szCs w:val="28"/>
+        </w:rPr>
+        <w:drawing>
+          <wp:inline distT="0" distB="0" distL="0" distR="0" wp14:anchorId="697CA10C" wp14:editId="20205441">
+            <wp:extent cx="5943600" cy="1347470"/>
+            <wp:effectExtent l="0" t="0" r="0" b="5080"/>
+            <wp:docPr id="1750666443" name="Picture 1"/>
+            <wp:cNvGraphicFramePr>
+              <a:graphicFrameLocks xmlns:a="http://schemas.openxmlformats.org/drawingml/2006/main" noChangeAspect="1"/>
+            </wp:cNvGraphicFramePr>
+            <a:graphic xmlns:a="http://schemas.openxmlformats.org/drawingml/2006/main">
+              <a:graphicData uri="http://schemas.openxmlformats.org/drawingml/2006/picture">
+                <pic:pic xmlns:pic="http://schemas.openxmlformats.org/drawingml/2006/picture">
+                  <pic:nvPicPr>
+                    <pic:cNvPr id="1750666443" name=""/>
+                    <pic:cNvPicPr/>
+                  </pic:nvPicPr>
+                  <pic:blipFill>
+                    <a:blip r:embed="rId120"/>
+                    <a:stretch>
+                      <a:fillRect/>
+                    </a:stretch>
+                  </pic:blipFill>
+                  <pic:spPr>
+                    <a:xfrm>
+                      <a:off x="0" y="0"/>
+                      <a:ext cx="5943600" cy="1347470"/>
+                    </a:xfrm>
+                    <a:prstGeom prst="rect">
+                      <a:avLst/>
+                    </a:prstGeom>
+                  </pic:spPr>
+                </pic:pic>
+              </a:graphicData>
+            </a:graphic>
+          </wp:inline>
+        </w:drawing>
+      </w:r>
+    </w:p>
+    <w:p>
+      <w:pPr>
+        <w:rPr>
+          <w:sz w:val="28"/>
+          <w:szCs w:val="28"/>
+        </w:rPr>
+      </w:pPr>
+      <w:r>
+        <w:rPr>
+          <w:noProof/>
+          <w:sz w:val="28"/>
+          <w:szCs w:val="28"/>
+        </w:rPr>
+        <w:drawing>
+          <wp:inline distT="0" distB="0" distL="0" distR="0" wp14:anchorId="1CF28219" wp14:editId="799052FD">
+            <wp:extent cx="5943600" cy="1003300"/>
+            <wp:effectExtent l="0" t="0" r="0" b="6350"/>
+            <wp:docPr id="1383552448" name="Picture 1"/>
+            <wp:cNvGraphicFramePr>
+              <a:graphicFrameLocks xmlns:a="http://schemas.openxmlformats.org/drawingml/2006/main" noChangeAspect="1"/>
+            </wp:cNvGraphicFramePr>
+            <a:graphic xmlns:a="http://schemas.openxmlformats.org/drawingml/2006/main">
+              <a:graphicData uri="http://schemas.openxmlformats.org/drawingml/2006/picture">
+                <pic:pic xmlns:pic="http://schemas.openxmlformats.org/drawingml/2006/picture">
+                  <pic:nvPicPr>
+                    <pic:cNvPr id="1383552448" name=""/>
+                    <pic:cNvPicPr/>
+                  </pic:nvPicPr>
+                  <pic:blipFill>
+                    <a:blip r:embed="rId121"/>
+                    <a:stretch>
+                      <a:fillRect/>
+                    </a:stretch>
+                  </pic:blipFill>
+                  <pic:spPr>
+                    <a:xfrm>
+                      <a:off x="0" y="0"/>
+                      <a:ext cx="5943600" cy="1003300"/>
+                    </a:xfrm>
+                    <a:prstGeom prst="rect">
+                      <a:avLst/>
+                    </a:prstGeom>
+                  </pic:spPr>
+                </pic:pic>
+              </a:graphicData>
+            </a:graphic>
+          </wp:inline>
+        </w:drawing>
+      </w:r>
+    </w:p>
+    <w:p>
+      <w:pPr>
+        <w:rPr>
+          <w:sz w:val="28"/>
+          <w:szCs w:val="28"/>
+        </w:rPr>
+      </w:pPr>
+      <w:r>
+        <w:rPr>
+          <w:sz w:val="28"/>
+          <w:szCs w:val="28"/>
+        </w:rPr>
+        <w:t>….</w:t>
+      </w:r>
+    </w:p>
+    <w:p>
+      <w:pPr>
+        <w:rPr>
+          <w:sz w:val="28"/>
+          <w:szCs w:val="28"/>
+        </w:rPr>
+      </w:pPr>
+      <w:r>
+        <w:rPr>
+          <w:noProof/>
+          <w:sz w:val="28"/>
+          <w:szCs w:val="28"/>
+        </w:rPr>
+        <w:drawing>
+          <wp:inline distT="0" distB="0" distL="0" distR="0" wp14:anchorId="76B8D244" wp14:editId="5EDEB2C6">
+            <wp:extent cx="5943600" cy="1503680"/>
+            <wp:effectExtent l="0" t="0" r="0" b="1270"/>
+            <wp:docPr id="2088552692" name="Picture 1"/>
+            <wp:cNvGraphicFramePr>
+              <a:graphicFrameLocks xmlns:a="http://schemas.openxmlformats.org/drawingml/2006/main" noChangeAspect="1"/>
+            </wp:cNvGraphicFramePr>
+            <a:graphic xmlns:a="http://schemas.openxmlformats.org/drawingml/2006/main">
+              <a:graphicData uri="http://schemas.openxmlformats.org/drawingml/2006/picture">
+                <pic:pic xmlns:pic="http://schemas.openxmlformats.org/drawingml/2006/picture">
+                  <pic:nvPicPr>
+                    <pic:cNvPr id="2088552692" name=""/>
+                    <pic:cNvPicPr/>
+                  </pic:nvPicPr>
+                  <pic:blipFill>
+                    <a:blip r:embed="rId122"/>
+                    <a:stretch>
+                      <a:fillRect/>
+                    </a:stretch>
+                  </pic:blipFill>
+                  <pic:spPr>
+                    <a:xfrm>
+                      <a:off x="0" y="0"/>
+                      <a:ext cx="5943600" cy="1503680"/>
+                    </a:xfrm>
+                    <a:prstGeom prst="rect">
+                      <a:avLst/>
+                    </a:prstGeom>
+                  </pic:spPr>
+                </pic:pic>
+              </a:graphicData>
+            </a:graphic>
+          </wp:inline>
+        </w:drawing>
+      </w:r>
+    </w:p>
+    <w:p>
+      <w:pPr>
+        <w:rPr>
+          <w:sz w:val="28"/>
+          <w:szCs w:val="28"/>
+        </w:rPr>
+      </w:pPr>
+    </w:p>
+    <w:p>
+      <w:pPr>
+        <w:rPr>
+          <w:sz w:val="28"/>
+          <w:szCs w:val="28"/>
+        </w:rPr>
+      </w:pPr>
+      <w:r>
+        <w:rPr>
+          <w:sz w:val="28"/>
+          <w:szCs w:val="28"/>
+        </w:rPr>
+        <w:t>Set Parameter values for the solver</w:t>
+      </w:r>
+    </w:p>
+    <w:p>
+      <w:pPr>
+        <w:rPr>
+          <w:sz w:val="28"/>
+          <w:szCs w:val="28"/>
+        </w:rPr>
+      </w:pPr>
+      <w:r>
+        <w:rPr>
+          <w:noProof/>
+          <w:sz w:val="28"/>
+          <w:szCs w:val="28"/>
+        </w:rPr>
+        <w:drawing>
+          <wp:inline distT="0" distB="0" distL="0" distR="0" wp14:anchorId="37C105E5" wp14:editId="2C5C988B">
+            <wp:extent cx="5037667" cy="1469320"/>
+            <wp:effectExtent l="0" t="0" r="0" b="0"/>
+            <wp:docPr id="739979950" name="Picture 1"/>
+            <wp:cNvGraphicFramePr>
+              <a:graphicFrameLocks xmlns:a="http://schemas.openxmlformats.org/drawingml/2006/main" noChangeAspect="1"/>
+            </wp:cNvGraphicFramePr>
+            <a:graphic xmlns:a="http://schemas.openxmlformats.org/drawingml/2006/main">
+              <a:graphicData uri="http://schemas.openxmlformats.org/drawingml/2006/picture">
+                <pic:pic xmlns:pic="http://schemas.openxmlformats.org/drawingml/2006/picture">
+                  <pic:nvPicPr>
+                    <pic:cNvPr id="739979950" name=""/>
+                    <pic:cNvPicPr/>
+                  </pic:nvPicPr>
+                  <pic:blipFill>
+                    <a:blip r:embed="rId123"/>
+                    <a:stretch>
+                      <a:fillRect/>
+                    </a:stretch>
+                  </pic:blipFill>
+                  <pic:spPr>
+                    <a:xfrm>
+                      <a:off x="0" y="0"/>
+                      <a:ext cx="5052457" cy="1473634"/>
+                    </a:xfrm>
+                    <a:prstGeom prst="rect">
+                      <a:avLst/>
+                    </a:prstGeom>
+                  </pic:spPr>
+                </pic:pic>
+              </a:graphicData>
+            </a:graphic>
+          </wp:inline>
+        </w:drawing>
+      </w:r>
+    </w:p>
+    <w:p>
+      <w:pPr>
+        <w:rPr>
+          <w:sz w:val="28"/>
+          <w:szCs w:val="28"/>
+        </w:rPr>
+      </w:pPr>
+      <w:r>
+        <w:rPr>
+          <w:noProof/>
+          <w:sz w:val="28"/>
+          <w:szCs w:val="28"/>
+        </w:rPr>
+        <w:lastRenderedPageBreak/>
+        <w:drawing>
+          <wp:inline distT="0" distB="0" distL="0" distR="0" wp14:anchorId="337386F0" wp14:editId="720C7835">
+            <wp:extent cx="3848433" cy="1600339"/>
+            <wp:effectExtent l="0" t="0" r="0" b="0"/>
+            <wp:docPr id="1111687644" name="Picture 1"/>
+            <wp:cNvGraphicFramePr>
+              <a:graphicFrameLocks xmlns:a="http://schemas.openxmlformats.org/drawingml/2006/main" noChangeAspect="1"/>
+            </wp:cNvGraphicFramePr>
+            <a:graphic xmlns:a="http://schemas.openxmlformats.org/drawingml/2006/main">
+              <a:graphicData uri="http://schemas.openxmlformats.org/drawingml/2006/picture">
+                <pic:pic xmlns:pic="http://schemas.openxmlformats.org/drawingml/2006/picture">
+                  <pic:nvPicPr>
+                    <pic:cNvPr id="1111687644" name=""/>
+                    <pic:cNvPicPr/>
+                  </pic:nvPicPr>
+                  <pic:blipFill>
+                    <a:blip r:embed="rId124"/>
+                    <a:stretch>
+                      <a:fillRect/>
+                    </a:stretch>
+                  </pic:blipFill>
+                  <pic:spPr>
+                    <a:xfrm>
+                      <a:off x="0" y="0"/>
+                      <a:ext cx="3848433" cy="1600339"/>
+                    </a:xfrm>
+                    <a:prstGeom prst="rect">
+                      <a:avLst/>
+                    </a:prstGeom>
+                  </pic:spPr>
+                </pic:pic>
+              </a:graphicData>
+            </a:graphic>
+          </wp:inline>
+        </w:drawing>
+      </w:r>
+    </w:p>
+    <w:p>
+      <w:pPr>
+        <w:rPr>
+          <w:sz w:val="28"/>
+          <w:szCs w:val="28"/>
+        </w:rPr>
+      </w:pPr>
+      <w:r>
+        <w:rPr>
+          <w:noProof/>
+          <w:sz w:val="28"/>
+          <w:szCs w:val="28"/>
+        </w:rPr>
+        <w:drawing>
+          <wp:inline distT="0" distB="0" distL="0" distR="0" wp14:anchorId="58F414E7" wp14:editId="6E8A725B">
+            <wp:extent cx="5943600" cy="1954530"/>
+            <wp:effectExtent l="0" t="0" r="0" b="7620"/>
+            <wp:docPr id="503107557" name="Picture 1"/>
+            <wp:cNvGraphicFramePr>
+              <a:graphicFrameLocks xmlns:a="http://schemas.openxmlformats.org/drawingml/2006/main" noChangeAspect="1"/>
+            </wp:cNvGraphicFramePr>
+            <a:graphic xmlns:a="http://schemas.openxmlformats.org/drawingml/2006/main">
+              <a:graphicData uri="http://schemas.openxmlformats.org/drawingml/2006/picture">
+                <pic:pic xmlns:pic="http://schemas.openxmlformats.org/drawingml/2006/picture">
+                  <pic:nvPicPr>
+                    <pic:cNvPr id="503107557" name=""/>
+                    <pic:cNvPicPr/>
+                  </pic:nvPicPr>
+                  <pic:blipFill>
+                    <a:blip r:embed="rId125"/>
+                    <a:stretch>
+                      <a:fillRect/>
+                    </a:stretch>
+                  </pic:blipFill>
+                  <pic:spPr>
+                    <a:xfrm>
+                      <a:off x="0" y="0"/>
+                      <a:ext cx="5943600" cy="1954530"/>
+                    </a:xfrm>
+                    <a:prstGeom prst="rect">
+                      <a:avLst/>
+                    </a:prstGeom>
+                  </pic:spPr>
+                </pic:pic>
+              </a:graphicData>
+            </a:graphic>
+          </wp:inline>
+        </w:drawing>
+      </w:r>
+    </w:p>
+    <w:p>
+      <w:pPr>
+        <w:rPr>
+          <w:sz w:val="28"/>
+          <w:szCs w:val="28"/>
+        </w:rPr>
+      </w:pPr>
+    </w:p>
+    <w:p>
+      <w:pPr>
+        <w:rPr>
+          <w:sz w:val="28"/>
+          <w:szCs w:val="28"/>
+        </w:rPr>
+      </w:pPr>
+      <w:r>
+        <w:rPr>
+          <w:sz w:val="28"/>
+          <w:szCs w:val="28"/>
+        </w:rPr>
+        <w:t>Add proper constraint statements and</w:t>
+      </w:r>
+      <w:r>
+        <w:rPr>
+          <w:sz w:val="28"/>
+          <w:szCs w:val="28"/>
+        </w:rPr>
+        <w:t xml:space="preserve"> proper parameters that need to change</w:t>
+      </w:r>
+      <w:r>
+        <w:rPr>
+          <w:sz w:val="28"/>
+          <w:szCs w:val="28"/>
+        </w:rPr>
+        <w:t>.</w:t>
+      </w:r>
+      <w:r>
+        <w:rPr>
+          <w:sz w:val="28"/>
+          <w:szCs w:val="28"/>
+        </w:rPr>
+        <w:t xml:space="preserve"> Set </w:t>
+      </w:r>
+      <w:r>
+        <w:rPr>
+          <w:sz w:val="28"/>
+          <w:szCs w:val="28"/>
+        </w:rPr>
+        <w:t>the check mark off for non-negative constraint option.</w:t>
+      </w:r>
+    </w:p>
+    <w:p>
+      <w:pPr>
+        <w:rPr>
+          <w:sz w:val="28"/>
+          <w:szCs w:val="28"/>
+        </w:rPr>
+      </w:pPr>
+      <w:r>
+        <w:rPr>
+          <w:noProof/>
+          <w:sz w:val="28"/>
+          <w:szCs w:val="28"/>
+        </w:rPr>
+        <w:drawing>
+          <wp:inline distT="0" distB="0" distL="0" distR="0" wp14:anchorId="014986F0" wp14:editId="0238F500">
+            <wp:extent cx="3389852" cy="3158067"/>
+            <wp:effectExtent l="0" t="0" r="1270" b="4445"/>
+            <wp:docPr id="380674905" name="Picture 4"/>
+            <wp:cNvGraphicFramePr>
+              <a:graphicFrameLocks xmlns:a="http://schemas.openxmlformats.org/drawingml/2006/main" noChangeAspect="1"/>
+            </wp:cNvGraphicFramePr>
+            <a:graphic xmlns:a="http://schemas.openxmlformats.org/drawingml/2006/main">
+              <a:graphicData uri="http://schemas.openxmlformats.org/drawingml/2006/picture">
+                <pic:pic xmlns:pic="http://schemas.openxmlformats.org/drawingml/2006/picture">
+                  <pic:nvPicPr>
+                    <pic:cNvPr id="0" name="Picture 16"/>
+                    <pic:cNvPicPr>
+                      <a:picLocks noChangeAspect="1" noChangeArrowheads="1"/>
+                    </pic:cNvPicPr>
+                  </pic:nvPicPr>
+                  <pic:blipFill>
+                    <a:blip r:embed="rId126">
+                      <a:extLst>
+                        <a:ext uri="{28A0092B-C50C-407E-A947-70E740481C1C}">
+                          <a14:useLocalDpi xmlns:a14="http://schemas.microsoft.com/office/drawing/2010/main" val="0"/>
+                        </a:ext>
+                      </a:extLst>
+                    </a:blip>
+                    <a:srcRect/>
+                    <a:stretch>
+                      <a:fillRect/>
+                    </a:stretch>
+                  </pic:blipFill>
+                  <pic:spPr bwMode="auto">
+                    <a:xfrm>
+                      <a:off x="0" y="0"/>
+                      <a:ext cx="3397057" cy="3164779"/>
+                    </a:xfrm>
+                    <a:prstGeom prst="rect">
+                      <a:avLst/>
+                    </a:prstGeom>
+                    <a:noFill/>
+                    <a:ln>
+                      <a:noFill/>
+                    </a:ln>
+                  </pic:spPr>
+                </pic:pic>
+              </a:graphicData>
+            </a:graphic>
+          </wp:inline>
+        </w:drawing>
+      </w:r>
+    </w:p>
+    <w:p>
+      <w:pPr>
+        <w:rPr>
+          <w:sz w:val="28"/>
+          <w:szCs w:val="28"/>
+        </w:rPr>
+      </w:pPr>
+      <w:r>
+        <w:rPr>
+          <w:sz w:val="28"/>
+          <w:szCs w:val="28"/>
+        </w:rPr>
+        <w:lastRenderedPageBreak/>
+        <w:t xml:space="preserve">Here are the optimized </w:t>
+      </w:r>
+      <w:r>
+        <w:rPr>
+          <w:sz w:val="28"/>
+          <w:szCs w:val="28"/>
+        </w:rPr>
+        <w:t>parameter</w:t>
+      </w:r>
+      <w:r>
+        <w:rPr>
+          <w:sz w:val="28"/>
+          <w:szCs w:val="28"/>
+        </w:rPr>
+        <w:t xml:space="preserve"> </w:t>
+      </w:r>
+      <w:r>
+        <w:rPr>
+          <w:sz w:val="28"/>
+          <w:szCs w:val="28"/>
+        </w:rPr>
+        <w:t>after the solver</w:t>
+      </w:r>
+      <w:r>
+        <w:rPr>
+          <w:sz w:val="28"/>
+          <w:szCs w:val="28"/>
+        </w:rPr>
+        <w:t xml:space="preserve"> converges</w:t>
+      </w:r>
+    </w:p>
+    <w:p>
+      <w:pPr>
+        <w:rPr>
+          <w:sz w:val="28"/>
+          <w:szCs w:val="28"/>
+        </w:rPr>
+      </w:pPr>
+      <w:r>
+        <w:rPr>
+          <w:noProof/>
+          <w:sz w:val="28"/>
+          <w:szCs w:val="28"/>
+        </w:rPr>
+        <w:drawing>
+          <wp:inline distT="0" distB="0" distL="0" distR="0" wp14:anchorId="47A48ED5" wp14:editId="0F086DE1">
+            <wp:extent cx="586791" cy="1988992"/>
+            <wp:effectExtent l="0" t="0" r="3810" b="0"/>
+            <wp:docPr id="1802638367" name="Picture 1"/>
+            <wp:cNvGraphicFramePr>
+              <a:graphicFrameLocks xmlns:a="http://schemas.openxmlformats.org/drawingml/2006/main" noChangeAspect="1"/>
+            </wp:cNvGraphicFramePr>
+            <a:graphic xmlns:a="http://schemas.openxmlformats.org/drawingml/2006/main">
+              <a:graphicData uri="http://schemas.openxmlformats.org/drawingml/2006/picture">
+                <pic:pic xmlns:pic="http://schemas.openxmlformats.org/drawingml/2006/picture">
+                  <pic:nvPicPr>
+                    <pic:cNvPr id="1802638367" name=""/>
+                    <pic:cNvPicPr/>
+                  </pic:nvPicPr>
+                  <pic:blipFill>
+                    <a:blip r:embed="rId127"/>
+                    <a:stretch>
+                      <a:fillRect/>
+                    </a:stretch>
+                  </pic:blipFill>
+                  <pic:spPr>
+                    <a:xfrm>
+                      <a:off x="0" y="0"/>
+                      <a:ext cx="586791" cy="1988992"/>
+                    </a:xfrm>
+                    <a:prstGeom prst="rect">
+                      <a:avLst/>
+                    </a:prstGeom>
+                  </pic:spPr>
+                </pic:pic>
+              </a:graphicData>
+            </a:graphic>
+          </wp:inline>
+        </w:drawing>
+      </w:r>
+    </w:p>
+    <w:p>
+      <w:pPr>
+        <w:rPr>
+          <w:sz w:val="28"/>
+          <w:szCs w:val="28"/>
+        </w:rPr>
+      </w:pPr>
+      <w:r>
+        <w:rPr>
+          <w:sz w:val="28"/>
+          <w:szCs w:val="28"/>
+        </w:rPr>
+        <w:t>…</w:t>
+      </w:r>
+    </w:p>
+    <w:p>
+      <w:pPr>
+        <w:rPr>
+          <w:sz w:val="28"/>
+          <w:szCs w:val="28"/>
+        </w:rPr>
+      </w:pPr>
+      <w:r>
+        <w:rPr>
+          <w:noProof/>
+          <w:sz w:val="28"/>
+          <w:szCs w:val="28"/>
+        </w:rPr>
+        <w:drawing>
+          <wp:inline distT="0" distB="0" distL="0" distR="0" wp14:anchorId="11B203BD" wp14:editId="75461EA2">
+            <wp:extent cx="3696020" cy="426757"/>
+            <wp:effectExtent l="0" t="0" r="0" b="0"/>
+            <wp:docPr id="121543621" name="Picture 1"/>
+            <wp:cNvGraphicFramePr>
+              <a:graphicFrameLocks xmlns:a="http://schemas.openxmlformats.org/drawingml/2006/main" noChangeAspect="1"/>
+            </wp:cNvGraphicFramePr>
+            <a:graphic xmlns:a="http://schemas.openxmlformats.org/drawingml/2006/main">
+              <a:graphicData uri="http://schemas.openxmlformats.org/drawingml/2006/picture">
+                <pic:pic xmlns:pic="http://schemas.openxmlformats.org/drawingml/2006/picture">
+                  <pic:nvPicPr>
+                    <pic:cNvPr id="121543621" name=""/>
+                    <pic:cNvPicPr/>
+                  </pic:nvPicPr>
+                  <pic:blipFill>
+                    <a:blip r:embed="rId128"/>
+                    <a:stretch>
+                      <a:fillRect/>
+                    </a:stretch>
+                  </pic:blipFill>
+                  <pic:spPr>
+                    <a:xfrm>
+                      <a:off x="0" y="0"/>
+                      <a:ext cx="3696020" cy="426757"/>
+                    </a:xfrm>
+                    <a:prstGeom prst="rect">
+                      <a:avLst/>
+                    </a:prstGeom>
+                  </pic:spPr>
+                </pic:pic>
+              </a:graphicData>
+            </a:graphic>
+          </wp:inline>
+        </w:drawing>
+      </w:r>
+    </w:p>
+    <w:p>
+      <w:pPr>
+        <w:rPr>
+          <w:sz w:val="28"/>
+          <w:szCs w:val="28"/>
+        </w:rPr>
+      </w:pPr>
+      <w:r>
+        <w:rPr>
+          <w:sz w:val="28"/>
+          <w:szCs w:val="28"/>
+        </w:rPr>
+        <w:t xml:space="preserve">Note bx is </w:t>
+      </w:r>
+      <w:r>
+        <w:rPr>
+          <w:sz w:val="28"/>
+          <w:szCs w:val="28"/>
+        </w:rPr>
+        <w:t>age-based</w:t>
+      </w:r>
+      <w:r>
+        <w:rPr>
+          <w:sz w:val="28"/>
+          <w:szCs w:val="28"/>
+        </w:rPr>
+        <w:t xml:space="preserve"> </w:t>
+      </w:r>
+      <w:r>
+        <w:rPr>
+          <w:sz w:val="28"/>
+          <w:szCs w:val="28"/>
+        </w:rPr>
+        <w:t>index and kt is the year-based mortality index. Further analysis will be done on python</w:t>
+      </w:r>
+      <w:r>
+        <w:rPr>
+          <w:sz w:val="28"/>
+          <w:szCs w:val="28"/>
+        </w:rPr>
+        <w:t>.</w:t>
+      </w:r>
+    </w:p>
+    <w:p>
+      <w:pPr>
+        <w:rPr>
+          <w:sz w:val="28"/>
+          <w:szCs w:val="28"/>
+        </w:rPr>
+      </w:pPr>
+    </w:p>
+    <w:p>
+      <w:pPr>
+        <w:rPr>
+          <w:sz w:val="28"/>
+          <w:szCs w:val="28"/>
+        </w:rPr>
+      </w:pPr>
+      <w:r>
+        <w:rPr>
+          <w:sz w:val="28"/>
+          <w:szCs w:val="28"/>
+        </w:rPr>
+        <w:t xml:space="preserve">Reformat </w:t>
+      </w:r>
+      <w:r>
+        <w:rPr>
+          <w:sz w:val="28"/>
+          <w:szCs w:val="28"/>
+        </w:rPr>
+        <w:t>the e^2_2015 to e_2015 for analysis</w:t>
+      </w:r>
+      <w:r>
+        <w:rPr>
+          <w:sz w:val="28"/>
+          <w:szCs w:val="28"/>
+        </w:rPr>
+        <w:t>.</w:t>
+      </w:r>
+    </w:p>
+    <w:p>
+      <w:pPr>
+        <w:rPr>
+          <w:sz w:val="28"/>
+          <w:szCs w:val="28"/>
+        </w:rPr>
+      </w:pPr>
+      <w:r>
+        <w:rPr>
+          <w:noProof/>
+          <w:sz w:val="28"/>
+          <w:szCs w:val="28"/>
+        </w:rPr>
+        <w:drawing>
+          <wp:inline distT="0" distB="0" distL="0" distR="0" wp14:anchorId="475B7F62" wp14:editId="75670817">
+            <wp:extent cx="5943600" cy="1144905"/>
+            <wp:effectExtent l="0" t="0" r="0" b="0"/>
+            <wp:docPr id="18697166" name="Picture 1"/>
+            <wp:cNvGraphicFramePr>
+              <a:graphicFrameLocks xmlns:a="http://schemas.openxmlformats.org/drawingml/2006/main" noChangeAspect="1"/>
+            </wp:cNvGraphicFramePr>
+            <a:graphic xmlns:a="http://schemas.openxmlformats.org/drawingml/2006/main">
+              <a:graphicData uri="http://schemas.openxmlformats.org/drawingml/2006/picture">
+                <pic:pic xmlns:pic="http://schemas.openxmlformats.org/drawingml/2006/picture">
+                  <pic:nvPicPr>
+                    <pic:cNvPr id="18697166" name=""/>
+                    <pic:cNvPicPr/>
+                  </pic:nvPicPr>
+                  <pic:blipFill>
+                    <a:blip r:embed="rId129"/>
+                    <a:stretch>
+                      <a:fillRect/>
+                    </a:stretch>
+                  </pic:blipFill>
+                  <pic:spPr>
+                    <a:xfrm>
+                      <a:off x="0" y="0"/>
+                      <a:ext cx="5943600" cy="1144905"/>
+                    </a:xfrm>
+                    <a:prstGeom prst="rect">
+                      <a:avLst/>
+                    </a:prstGeom>
+                  </pic:spPr>
+                </pic:pic>
+              </a:graphicData>
+            </a:graphic>
+          </wp:inline>
+        </w:drawing>
+      </w:r>
+    </w:p>
+    <w:p>
+      <w:pPr>
+        <w:rPr>
+          <w:sz w:val="28"/>
+          <w:szCs w:val="28"/>
+        </w:rPr>
+      </w:pPr>
+      <w:r>
+        <w:rPr>
+          <w:sz w:val="28"/>
+          <w:szCs w:val="28"/>
+        </w:rPr>
+        <w:t>…</w:t>
+      </w:r>
+    </w:p>
+    <w:p>
+      <w:pPr>
+        <w:rPr>
+          <w:sz w:val="28"/>
+          <w:szCs w:val="28"/>
+        </w:rPr>
+      </w:pPr>
+      <w:r>
+        <w:rPr>
+          <w:noProof/>
+          <w:sz w:val="28"/>
+          <w:szCs w:val="28"/>
+        </w:rPr>
+        <w:drawing>
+          <wp:inline distT="0" distB="0" distL="0" distR="0" wp14:anchorId="247D75F1" wp14:editId="5790F3AA">
+            <wp:extent cx="5943600" cy="1000125"/>
+            <wp:effectExtent l="0" t="0" r="0" b="9525"/>
+            <wp:docPr id="2004678808" name="Picture 1"/>
+            <wp:cNvGraphicFramePr>
+              <a:graphicFrameLocks xmlns:a="http://schemas.openxmlformats.org/drawingml/2006/main" noChangeAspect="1"/>
+            </wp:cNvGraphicFramePr>
+            <a:graphic xmlns:a="http://schemas.openxmlformats.org/drawingml/2006/main">
+              <a:graphicData uri="http://schemas.openxmlformats.org/drawingml/2006/picture">
+                <pic:pic xmlns:pic="http://schemas.openxmlformats.org/drawingml/2006/picture">
+                  <pic:nvPicPr>
+                    <pic:cNvPr id="2004678808" name=""/>
+                    <pic:cNvPicPr/>
+                  </pic:nvPicPr>
+                  <pic:blipFill>
+                    <a:blip r:embed="rId130"/>
+                    <a:stretch>
+                      <a:fillRect/>
+                    </a:stretch>
+                  </pic:blipFill>
+                  <pic:spPr>
+                    <a:xfrm>
+                      <a:off x="0" y="0"/>
+                      <a:ext cx="5943600" cy="1000125"/>
+                    </a:xfrm>
+                    <a:prstGeom prst="rect">
+                      <a:avLst/>
+                    </a:prstGeom>
+                  </pic:spPr>
+                </pic:pic>
+              </a:graphicData>
+            </a:graphic>
+          </wp:inline>
+        </w:drawing>
+      </w:r>
+    </w:p>
+    <w:p>
+      <w:pPr>
+        <w:rPr>
+          <w:sz w:val="28"/>
+          <w:szCs w:val="28"/>
+        </w:rPr>
+      </w:pPr>
+    </w:p>
+    <w:p>
+      <w:pPr>
+        <w:rPr>
+          <w:sz w:val="28"/>
+          <w:szCs w:val="28"/>
+        </w:rPr>
+      </w:pPr>
+    </w:p>
+    <w:p>
+      <w:pPr>
+        <w:rPr>
+          <w:sz w:val="28"/>
+          <w:szCs w:val="28"/>
+        </w:rPr>
+      </w:pPr>
+      <w:r>
+        <w:rPr>
+          <w:sz w:val="28"/>
+          <w:szCs w:val="28"/>
+        </w:rPr>
+        <w:lastRenderedPageBreak/>
+        <w:t xml:space="preserve">Change to SUMSQ formula for RSS now since </w:t>
+      </w:r>
+      <w:r>
+        <w:rPr>
+          <w:sz w:val="28"/>
+          <w:szCs w:val="28"/>
+        </w:rPr>
+        <w:t>columns are e(x,t).</w:t>
+      </w:r>
+    </w:p>
+    <w:p>
+      <w:pPr>
+        <w:rPr>
+          <w:sz w:val="28"/>
+          <w:szCs w:val="28"/>
+        </w:rPr>
+      </w:pPr>
+      <w:r>
+        <w:rPr>
+          <w:noProof/>
+          <w:sz w:val="28"/>
+          <w:szCs w:val="28"/>
+        </w:rPr>
+        <w:drawing>
+          <wp:inline distT="0" distB="0" distL="0" distR="0" wp14:anchorId="188E6128" wp14:editId="2931FFA5">
+            <wp:extent cx="2956816" cy="1486029"/>
+            <wp:effectExtent l="0" t="0" r="0" b="0"/>
+            <wp:docPr id="1997301717" name="Picture 1"/>
+            <wp:cNvGraphicFramePr>
+              <a:graphicFrameLocks xmlns:a="http://schemas.openxmlformats.org/drawingml/2006/main" noChangeAspect="1"/>
+            </wp:cNvGraphicFramePr>
+            <a:graphic xmlns:a="http://schemas.openxmlformats.org/drawingml/2006/main">
+              <a:graphicData uri="http://schemas.openxmlformats.org/drawingml/2006/picture">
+                <pic:pic xmlns:pic="http://schemas.openxmlformats.org/drawingml/2006/picture">
+                  <pic:nvPicPr>
+                    <pic:cNvPr id="1997301717" name=""/>
+                    <pic:cNvPicPr/>
+                  </pic:nvPicPr>
+                  <pic:blipFill>
+                    <a:blip r:embed="rId131"/>
+                    <a:stretch>
+                      <a:fillRect/>
+                    </a:stretch>
+                  </pic:blipFill>
+                  <pic:spPr>
+                    <a:xfrm>
+                      <a:off x="0" y="0"/>
+                      <a:ext cx="2956816" cy="1486029"/>
+                    </a:xfrm>
+                    <a:prstGeom prst="rect">
+                      <a:avLst/>
+                    </a:prstGeom>
+                  </pic:spPr>
+                </pic:pic>
+              </a:graphicData>
+            </a:graphic>
+          </wp:inline>
+        </w:drawing>
+      </w:r>
+    </w:p>
+    <w:p>
+      <w:pPr>
+        <w:rPr>
+          <w:sz w:val="28"/>
+          <w:szCs w:val="28"/>
+        </w:rPr>
+      </w:pPr>
+    </w:p>
+    <w:p>
+      <w:pPr>
+        <w:rPr>
+          <w:sz w:val="28"/>
+          <w:szCs w:val="28"/>
+        </w:rPr>
+      </w:pPr>
+      <w:r>
+        <w:rPr>
+          <w:sz w:val="28"/>
+          <w:szCs w:val="28"/>
+        </w:rPr>
+        <w:t>Use formula below for R^2</w:t>
+      </w:r>
+    </w:p>
+    <w:p>
+      <w:pPr>
+        <w:rPr>
+          <w:sz w:val="28"/>
+          <w:szCs w:val="28"/>
+        </w:rPr>
+      </w:pPr>
+      <w:r>
+        <w:rPr>
+          <w:noProof/>
+          <w:sz w:val="28"/>
+          <w:szCs w:val="28"/>
+        </w:rPr>
+        <w:drawing>
+          <wp:inline distT="0" distB="0" distL="0" distR="0" wp14:anchorId="39501095" wp14:editId="67FFAE3D">
+            <wp:extent cx="5943600" cy="1080135"/>
+            <wp:effectExtent l="0" t="0" r="0" b="5715"/>
+            <wp:docPr id="345406016" name="Picture 1"/>
+            <wp:cNvGraphicFramePr>
+              <a:graphicFrameLocks xmlns:a="http://schemas.openxmlformats.org/drawingml/2006/main" noChangeAspect="1"/>
+            </wp:cNvGraphicFramePr>
+            <a:graphic xmlns:a="http://schemas.openxmlformats.org/drawingml/2006/main">
+              <a:graphicData uri="http://schemas.openxmlformats.org/drawingml/2006/picture">
+                <pic:pic xmlns:pic="http://schemas.openxmlformats.org/drawingml/2006/picture">
+                  <pic:nvPicPr>
+                    <pic:cNvPr id="345406016" name=""/>
+                    <pic:cNvPicPr/>
+                  </pic:nvPicPr>
+                  <pic:blipFill>
+                    <a:blip r:embed="rId132"/>
+                    <a:stretch>
+                      <a:fillRect/>
+                    </a:stretch>
+                  </pic:blipFill>
+                  <pic:spPr>
+                    <a:xfrm>
+                      <a:off x="0" y="0"/>
+                      <a:ext cx="5943600" cy="1080135"/>
+                    </a:xfrm>
+                    <a:prstGeom prst="rect">
+                      <a:avLst/>
+                    </a:prstGeom>
+                  </pic:spPr>
+                </pic:pic>
+              </a:graphicData>
+            </a:graphic>
+          </wp:inline>
+        </w:drawing>
+      </w:r>
+    </w:p>
+    <w:p>
+      <w:pPr>
+        <w:rPr>
+          <w:sz w:val="28"/>
+          <w:szCs w:val="28"/>
+        </w:rPr>
+      </w:pPr>
+    </w:p>
+    <w:p>
+      <w:pPr>
+        <w:rPr>
+          <w:sz w:val="28"/>
+          <w:szCs w:val="28"/>
+        </w:rPr>
+      </w:pPr>
+      <w:r>
+        <w:rPr>
+          <w:sz w:val="28"/>
+          <w:szCs w:val="28"/>
+        </w:rPr>
+        <w:t>Next create a</w:t>
+      </w:r>
+      <w:r>
+        <w:rPr>
+          <w:sz w:val="28"/>
+          <w:szCs w:val="28"/>
+        </w:rPr>
+        <w:t>n</w:t>
+      </w:r>
+      <w:r>
+        <w:rPr>
+          <w:sz w:val="28"/>
+          <w:szCs w:val="28"/>
+        </w:rPr>
+        <w:t xml:space="preserve"> </w:t>
+      </w:r>
+      <w:r>
+        <w:rPr>
+          <w:sz w:val="28"/>
+          <w:szCs w:val="28"/>
+        </w:rPr>
+        <w:t>average residual across all ages</w:t>
+      </w:r>
+      <w:r>
+        <w:rPr>
+          <w:sz w:val="28"/>
+          <w:szCs w:val="28"/>
+        </w:rPr>
+        <w:t xml:space="preserve"> and plot</w:t>
+      </w:r>
+    </w:p>
+    <w:p>
+      <w:pPr>
+        <w:rPr>
+          <w:sz w:val="28"/>
+          <w:szCs w:val="28"/>
+        </w:rPr>
+      </w:pPr>
+      <w:r>
+        <w:rPr>
+          <w:noProof/>
+          <w:sz w:val="28"/>
+          <w:szCs w:val="28"/>
+        </w:rPr>
+        <w:drawing>
+          <wp:inline distT="0" distB="0" distL="0" distR="0" wp14:anchorId="2E2D7009" wp14:editId="355998D7">
+            <wp:extent cx="5468192" cy="1134533"/>
+            <wp:effectExtent l="0" t="0" r="0" b="8890"/>
+            <wp:docPr id="1167752664" name="Picture 1"/>
+            <wp:cNvGraphicFramePr>
+              <a:graphicFrameLocks xmlns:a="http://schemas.openxmlformats.org/drawingml/2006/main" noChangeAspect="1"/>
+            </wp:cNvGraphicFramePr>
+            <a:graphic xmlns:a="http://schemas.openxmlformats.org/drawingml/2006/main">
+              <a:graphicData uri="http://schemas.openxmlformats.org/drawingml/2006/picture">
+                <pic:pic xmlns:pic="http://schemas.openxmlformats.org/drawingml/2006/picture">
+                  <pic:nvPicPr>
+                    <pic:cNvPr id="1167752664" name=""/>
+                    <pic:cNvPicPr/>
+                  </pic:nvPicPr>
+                  <pic:blipFill>
+                    <a:blip r:embed="rId133"/>
+                    <a:stretch>
+                      <a:fillRect/>
+                    </a:stretch>
+                  </pic:blipFill>
+                  <pic:spPr>
+                    <a:xfrm>
+                      <a:off x="0" y="0"/>
+                      <a:ext cx="5475294" cy="1136007"/>
+                    </a:xfrm>
+                    <a:prstGeom prst="rect">
+                      <a:avLst/>
+                    </a:prstGeom>
+                  </pic:spPr>
+                </pic:pic>
+              </a:graphicData>
+            </a:graphic>
+          </wp:inline>
+        </w:drawing>
+      </w:r>
+    </w:p>
+    <w:p>
+      <w:pPr>
+        <w:rPr>
+          <w:sz w:val="28"/>
+          <w:szCs w:val="28"/>
+        </w:rPr>
+      </w:pPr>
+      <w:r>
+        <w:rPr>
+          <w:noProof/>
+          <w:sz w:val="28"/>
+          <w:szCs w:val="28"/>
+        </w:rPr>
+        <w:drawing>
+          <wp:inline distT="0" distB="0" distL="0" distR="0" wp14:anchorId="3D2ECCEB" wp14:editId="44DF05B5">
+            <wp:extent cx="3658447" cy="2209800"/>
+            <wp:effectExtent l="0" t="0" r="0" b="0"/>
+            <wp:docPr id="1896133734" name="Picture 1"/>
+            <wp:cNvGraphicFramePr>
+              <a:graphicFrameLocks xmlns:a="http://schemas.openxmlformats.org/drawingml/2006/main" noChangeAspect="1"/>
+            </wp:cNvGraphicFramePr>
+            <a:graphic xmlns:a="http://schemas.openxmlformats.org/drawingml/2006/main">
+              <a:graphicData uri="http://schemas.openxmlformats.org/drawingml/2006/picture">
+                <pic:pic xmlns:pic="http://schemas.openxmlformats.org/drawingml/2006/picture">
+                  <pic:nvPicPr>
+                    <pic:cNvPr id="1896133734" name=""/>
+                    <pic:cNvPicPr/>
+                  </pic:nvPicPr>
+                  <pic:blipFill>
+                    <a:blip r:embed="rId134"/>
+                    <a:stretch>
+                      <a:fillRect/>
+                    </a:stretch>
+                  </pic:blipFill>
+                  <pic:spPr>
+                    <a:xfrm>
+                      <a:off x="0" y="0"/>
+                      <a:ext cx="3665966" cy="2214342"/>
+                    </a:xfrm>
+                    <a:prstGeom prst="rect">
+                      <a:avLst/>
+                    </a:prstGeom>
+                  </pic:spPr>
+                </pic:pic>
+              </a:graphicData>
+            </a:graphic>
+          </wp:inline>
+        </w:drawing>
+      </w:r>
+    </w:p>
+    <w:p>
+      <w:pPr>
+        <w:rPr>
+          <w:sz w:val="28"/>
+          <w:szCs w:val="28"/>
+        </w:rPr>
+      </w:pPr>
+      <w:r>
+        <w:rPr>
+          <w:sz w:val="28"/>
+          <w:szCs w:val="28"/>
+        </w:rPr>
+        <w:lastRenderedPageBreak/>
+        <w:t xml:space="preserve">Also </w:t>
+      </w:r>
+      <w:r>
+        <w:rPr>
+          <w:sz w:val="28"/>
+          <w:szCs w:val="28"/>
+        </w:rPr>
+        <w:t>color format the residuals</w:t>
+      </w:r>
+    </w:p>
+    <w:p>
+      <w:pPr>
+        <w:rPr>
+          <w:sz w:val="28"/>
+          <w:szCs w:val="28"/>
+        </w:rPr>
+      </w:pPr>
+      <w:r>
+        <w:rPr>
+          <w:noProof/>
+          <w:sz w:val="28"/>
+          <w:szCs w:val="28"/>
+        </w:rPr>
+        <w:drawing>
+          <wp:inline distT="0" distB="0" distL="0" distR="0" wp14:anchorId="5706683C" wp14:editId="2BD9AB67">
+            <wp:extent cx="3635055" cy="4427604"/>
+            <wp:effectExtent l="0" t="0" r="3810" b="0"/>
+            <wp:docPr id="1473645047" name="Picture 1"/>
+            <wp:cNvGraphicFramePr>
+              <a:graphicFrameLocks xmlns:a="http://schemas.openxmlformats.org/drawingml/2006/main" noChangeAspect="1"/>
+            </wp:cNvGraphicFramePr>
+            <a:graphic xmlns:a="http://schemas.openxmlformats.org/drawingml/2006/main">
+              <a:graphicData uri="http://schemas.openxmlformats.org/drawingml/2006/picture">
+                <pic:pic xmlns:pic="http://schemas.openxmlformats.org/drawingml/2006/picture">
+                  <pic:nvPicPr>
+                    <pic:cNvPr id="1473645047" name=""/>
+                    <pic:cNvPicPr/>
+                  </pic:nvPicPr>
+                  <pic:blipFill>
+                    <a:blip r:embed="rId135"/>
+                    <a:stretch>
+                      <a:fillRect/>
+                    </a:stretch>
+                  </pic:blipFill>
+                  <pic:spPr>
+                    <a:xfrm>
+                      <a:off x="0" y="0"/>
+                      <a:ext cx="3635055" cy="4427604"/>
+                    </a:xfrm>
+                    <a:prstGeom prst="rect">
+                      <a:avLst/>
+                    </a:prstGeom>
+                  </pic:spPr>
+                </pic:pic>
+              </a:graphicData>
+            </a:graphic>
+          </wp:inline>
+        </w:drawing>
+      </w:r>
+    </w:p>
+    <w:p>
+      <w:pPr>
+        <w:rPr>
+          <w:sz w:val="28"/>
+          <w:szCs w:val="28"/>
+        </w:rPr>
+      </w:pPr>
+      <w:r>
+        <w:rPr>
+          <w:sz w:val="28"/>
+          <w:szCs w:val="28"/>
+        </w:rPr>
+        <w:t>…</w:t>
+      </w:r>
+    </w:p>
+    <w:p>
+      <w:pPr>
+        <w:rPr>
+          <w:sz w:val="28"/>
+          <w:szCs w:val="28"/>
+        </w:rPr>
+      </w:pPr>
+    </w:p>
+    <w:p>
+      <w:pPr>
+        <w:rPr>
+          <w:sz w:val="28"/>
+          <w:szCs w:val="28"/>
+        </w:rPr>
+      </w:pPr>
+      <w:r>
+        <w:rPr>
+          <w:sz w:val="28"/>
+          <w:szCs w:val="28"/>
+        </w:rPr>
+        <w:t>Now for the</w:t>
+      </w:r>
+      <w:r>
+        <w:rPr>
+          <w:sz w:val="28"/>
+          <w:szCs w:val="28"/>
+        </w:rPr>
+        <w:t xml:space="preserve"> fitted vs observed ln(mx), </w:t>
+      </w:r>
+      <w:r>
+        <w:rPr>
+          <w:sz w:val="28"/>
+          <w:szCs w:val="28"/>
+        </w:rPr>
+        <w:t>use a(x) + b(x)*k</w:t>
+      </w:r>
+      <w:r>
+        <w:rPr>
+          <w:sz w:val="28"/>
+          <w:szCs w:val="28"/>
+        </w:rPr>
+        <w:t>(</w:t>
+      </w:r>
+      <w:r>
+        <w:rPr>
+          <w:sz w:val="28"/>
+          <w:szCs w:val="28"/>
+        </w:rPr>
+        <w:t>t)</w:t>
+      </w:r>
+      <w:r>
+        <w:rPr>
+          <w:sz w:val="28"/>
+          <w:szCs w:val="28"/>
+        </w:rPr>
+        <w:t xml:space="preserve"> = ln^(mx). The </w:t>
+      </w:r>
+      <w:r>
+        <w:rPr>
+          <w:sz w:val="28"/>
+          <w:szCs w:val="28"/>
+        </w:rPr>
+        <w:t>formula below</w:t>
+      </w:r>
+      <w:r>
+        <w:rPr>
+          <w:sz w:val="28"/>
+          <w:szCs w:val="28"/>
+        </w:rPr>
+        <w:t xml:space="preserve"> shows the calculation for the fitted values</w:t>
+      </w:r>
+      <w:r>
+        <w:rPr>
+          <w:sz w:val="28"/>
+          <w:szCs w:val="28"/>
+        </w:rPr>
+        <w:t>.</w:t>
+      </w:r>
+    </w:p>
+    <w:p>
+      <w:pPr>
+        <w:rPr>
+          <w:sz w:val="28"/>
+          <w:szCs w:val="28"/>
+        </w:rPr>
+      </w:pPr>
+      <w:r>
+        <w:rPr>
+          <w:sz w:val="28"/>
+          <w:szCs w:val="28"/>
+        </w:rPr>
+        <w:drawing>
+          <wp:inline distT="0" distB="0" distL="0" distR="0" wp14:anchorId="0894F3E9" wp14:editId="04D39039">
+            <wp:extent cx="5943600" cy="1367790"/>
+            <wp:effectExtent l="0" t="0" r="0" b="3810"/>
+            <wp:docPr id="1645296680" name="Picture 1"/>
+            <wp:cNvGraphicFramePr>
+              <a:graphicFrameLocks xmlns:a="http://schemas.openxmlformats.org/drawingml/2006/main" noChangeAspect="1"/>
+            </wp:cNvGraphicFramePr>
+            <a:graphic xmlns:a="http://schemas.openxmlformats.org/drawingml/2006/main">
+              <a:graphicData uri="http://schemas.openxmlformats.org/drawingml/2006/picture">
+                <pic:pic xmlns:pic="http://schemas.openxmlformats.org/drawingml/2006/picture">
+                  <pic:nvPicPr>
+                    <pic:cNvPr id="1645296680" name=""/>
+                    <pic:cNvPicPr/>
+                  </pic:nvPicPr>
+                  <pic:blipFill>
+                    <a:blip r:embed="rId136"/>
+                    <a:stretch>
+                      <a:fillRect/>
+                    </a:stretch>
+                  </pic:blipFill>
+                  <pic:spPr>
+                    <a:xfrm>
+                      <a:off x="0" y="0"/>
+                      <a:ext cx="5943600" cy="1367790"/>
+                    </a:xfrm>
+                    <a:prstGeom prst="rect">
+                      <a:avLst/>
+                    </a:prstGeom>
+                  </pic:spPr>
+                </pic:pic>
+              </a:graphicData>
+            </a:graphic>
+          </wp:inline>
+        </w:drawing>
+      </w:r>
+    </w:p>
+    <w:p>
+      <w:pPr>
+        <w:rPr>
+          <w:sz w:val="28"/>
+          <w:szCs w:val="28"/>
+        </w:rPr>
+      </w:pPr>
+      <w:r>
+        <w:rPr>
+          <w:sz w:val="28"/>
+          <w:szCs w:val="28"/>
+        </w:rPr>
+        <w:t>…</w:t>
+      </w:r>
+    </w:p>
+    <w:p>
+      <w:pPr>
+        <w:rPr>
+          <w:sz w:val="28"/>
+          <w:szCs w:val="28"/>
+        </w:rPr>
+      </w:pPr>
+      <w:r>
+        <w:rPr>
+          <w:sz w:val="28"/>
+          <w:szCs w:val="28"/>
+        </w:rPr>
+        <w:lastRenderedPageBreak/>
+        <w:t xml:space="preserve">Then </w:t>
+      </w:r>
+      <w:r>
+        <w:rPr>
+          <w:sz w:val="28"/>
+          <w:szCs w:val="28"/>
+        </w:rPr>
+        <w:t xml:space="preserve">create a 2-way line chart for each year. Just doing 2015 to see how well the Lee-Carter model </w:t>
+      </w:r>
+      <w:r>
+        <w:rPr>
+          <w:sz w:val="28"/>
+          <w:szCs w:val="28"/>
+        </w:rPr>
+        <w:t>fits</w:t>
+      </w:r>
+      <w:r>
+        <w:rPr>
+          <w:sz w:val="28"/>
+          <w:szCs w:val="28"/>
+        </w:rPr>
+        <w:t xml:space="preserve"> our actual data.</w:t>
+      </w:r>
+    </w:p>
+    <w:p>
+      <w:pPr>
+        <w:rPr>
+          <w:sz w:val="28"/>
+          <w:szCs w:val="28"/>
+        </w:rPr>
+      </w:pPr>
+      <w:r>
+        <w:rPr>
+          <w:sz w:val="28"/>
+          <w:szCs w:val="28"/>
+        </w:rPr>
+        <w:drawing>
+          <wp:inline distT="0" distB="0" distL="0" distR="0" wp14:anchorId="3FEC1117" wp14:editId="7610F284">
+            <wp:extent cx="1024467" cy="627098"/>
+            <wp:effectExtent l="0" t="0" r="4445" b="1905"/>
+            <wp:docPr id="1690242321" name="Picture 1"/>
+            <wp:cNvGraphicFramePr>
+              <a:graphicFrameLocks xmlns:a="http://schemas.openxmlformats.org/drawingml/2006/main" noChangeAspect="1"/>
+            </wp:cNvGraphicFramePr>
+            <a:graphic xmlns:a="http://schemas.openxmlformats.org/drawingml/2006/main">
+              <a:graphicData uri="http://schemas.openxmlformats.org/drawingml/2006/picture">
+                <pic:pic xmlns:pic="http://schemas.openxmlformats.org/drawingml/2006/picture">
+                  <pic:nvPicPr>
+                    <pic:cNvPr id="1690242321" name=""/>
+                    <pic:cNvPicPr/>
+                  </pic:nvPicPr>
+                  <pic:blipFill>
+                    <a:blip r:embed="rId137"/>
+                    <a:stretch>
+                      <a:fillRect/>
+                    </a:stretch>
+                  </pic:blipFill>
+                  <pic:spPr>
+                    <a:xfrm>
+                      <a:off x="0" y="0"/>
+                      <a:ext cx="1028163" cy="629360"/>
+                    </a:xfrm>
+                    <a:prstGeom prst="rect">
+                      <a:avLst/>
+                    </a:prstGeom>
+                  </pic:spPr>
+                </pic:pic>
+              </a:graphicData>
+            </a:graphic>
+          </wp:inline>
+        </w:drawing>
+      </w:r>
+    </w:p>
+    <w:p>
+      <w:pPr>
+        <w:rPr>
+          <w:sz w:val="28"/>
+          <w:szCs w:val="28"/>
+        </w:rPr>
+      </w:pPr>
+      <w:r>
+        <w:rPr>
+          <w:sz w:val="28"/>
+          <w:szCs w:val="28"/>
+        </w:rPr>
+        <w:drawing>
+          <wp:inline distT="0" distB="0" distL="0" distR="0" wp14:anchorId="14DF4354" wp14:editId="3481DED2">
+            <wp:extent cx="4838141" cy="2921000"/>
+            <wp:effectExtent l="0" t="0" r="635" b="0"/>
+            <wp:docPr id="1681203835" name="Picture 1"/>
+            <wp:cNvGraphicFramePr>
+              <a:graphicFrameLocks xmlns:a="http://schemas.openxmlformats.org/drawingml/2006/main" noChangeAspect="1"/>
+            </wp:cNvGraphicFramePr>
+            <a:graphic xmlns:a="http://schemas.openxmlformats.org/drawingml/2006/main">
+              <a:graphicData uri="http://schemas.openxmlformats.org/drawingml/2006/picture">
+                <pic:pic xmlns:pic="http://schemas.openxmlformats.org/drawingml/2006/picture">
+                  <pic:nvPicPr>
+                    <pic:cNvPr id="1681203835" name=""/>
+                    <pic:cNvPicPr/>
+                  </pic:nvPicPr>
+                  <pic:blipFill>
+                    <a:blip r:embed="rId138"/>
+                    <a:stretch>
+                      <a:fillRect/>
+                    </a:stretch>
+                  </pic:blipFill>
+                  <pic:spPr>
+                    <a:xfrm>
+                      <a:off x="0" y="0"/>
+                      <a:ext cx="4854077" cy="2930621"/>
+                    </a:xfrm>
+                    <a:prstGeom prst="rect">
+                      <a:avLst/>
+                    </a:prstGeom>
+                  </pic:spPr>
+                </pic:pic>
+              </a:graphicData>
+            </a:graphic>
+          </wp:inline>
+        </w:drawing>
+      </w:r>
+    </w:p>
+    <w:p>
+      <w:pPr>
+        <w:rPr>
+          <w:sz w:val="28"/>
+          <w:szCs w:val="28"/>
+        </w:rPr>
+      </w:pPr>
+    </w:p>
+    <w:p>
+      <w:pPr>
+        <w:rPr>
+          <w:sz w:val="28"/>
+          <w:szCs w:val="28"/>
+        </w:rPr>
+      </w:pPr>
+      <w:r>
+        <w:rPr>
+          <w:sz w:val="28"/>
+          <w:szCs w:val="28"/>
+          <w:lang w:val="fr-FR"/>
+        </w:rPr>
+        <w:t xml:space="preserve">Next calculate </w:t>
+      </w:r>
+      <w:r>
+        <w:rPr>
+          <w:sz w:val="28"/>
+          <w:szCs w:val="28"/>
+        </w:rPr>
+        <w:t>Δ</w:t>
+      </w:r>
+      <w:r>
+        <w:rPr>
+          <w:sz w:val="28"/>
+          <w:szCs w:val="28"/>
+          <w:lang w:val="fr-FR"/>
+        </w:rPr>
+        <w:t>K(t)</w:t>
+      </w:r>
+      <w:r>
+        <w:rPr>
+          <w:sz w:val="28"/>
+          <w:szCs w:val="28"/>
+          <w:lang w:val="fr-FR"/>
+        </w:rPr>
+        <w:t xml:space="preserve"> = K(t) – K(t</w:t>
+      </w:r>
+      <w:r>
+        <w:rPr>
+          <w:sz w:val="28"/>
+          <w:szCs w:val="28"/>
+          <w:lang w:val="fr-FR"/>
+        </w:rPr>
+        <w:t>-1).</w:t>
+      </w:r>
+      <w:r>
+        <w:rPr>
+          <w:sz w:val="28"/>
+          <w:szCs w:val="28"/>
+          <w:lang w:val="fr-FR"/>
+        </w:rPr>
+        <w:t xml:space="preserve"> </w:t>
+      </w:r>
+      <w:r>
+        <w:rPr>
+          <w:sz w:val="28"/>
+          <w:szCs w:val="28"/>
+        </w:rPr>
+        <w:t>Calculate drift which is t</w:t>
+      </w:r>
+      <w:r>
+        <w:rPr>
+          <w:sz w:val="28"/>
+          <w:szCs w:val="28"/>
+        </w:rPr>
+        <w:t xml:space="preserve">he mean of all </w:t>
+      </w:r>
+      <w:r>
+        <w:rPr>
+          <w:sz w:val="28"/>
+          <w:szCs w:val="28"/>
+        </w:rPr>
+        <w:t>Δ</w:t>
+      </w:r>
+      <w:r>
+        <w:rPr>
+          <w:sz w:val="28"/>
+          <w:szCs w:val="28"/>
+        </w:rPr>
+        <w:t>K(t)</w:t>
+      </w:r>
+      <w:r>
+        <w:rPr>
+          <w:sz w:val="28"/>
+          <w:szCs w:val="28"/>
+        </w:rPr>
+        <w:t>s.</w:t>
+      </w:r>
+      <w:r>
+        <w:rPr>
+          <w:sz w:val="28"/>
+          <w:szCs w:val="28"/>
+        </w:rPr>
+        <w:t xml:space="preserve"> Then create a residual column.</w:t>
+      </w:r>
+    </w:p>
+    <w:p>
+      <w:pPr>
+        <w:rPr>
+          <w:sz w:val="28"/>
+          <w:szCs w:val="28"/>
+          <w:lang w:val="fr-FR"/>
+        </w:rPr>
+      </w:pPr>
+      <w:r>
+        <w:rPr>
+          <w:sz w:val="28"/>
+          <w:szCs w:val="28"/>
+          <w:lang w:val="fr-FR"/>
+        </w:rPr>
+        <w:drawing>
+          <wp:inline distT="0" distB="0" distL="0" distR="0" wp14:anchorId="0BAE8336" wp14:editId="315FA184">
+            <wp:extent cx="1240799" cy="1092200"/>
+            <wp:effectExtent l="0" t="0" r="0" b="0"/>
+            <wp:docPr id="1217037513" name="Picture 1"/>
+            <wp:cNvGraphicFramePr>
+              <a:graphicFrameLocks xmlns:a="http://schemas.openxmlformats.org/drawingml/2006/main" noChangeAspect="1"/>
+            </wp:cNvGraphicFramePr>
+            <a:graphic xmlns:a="http://schemas.openxmlformats.org/drawingml/2006/main">
+              <a:graphicData uri="http://schemas.openxmlformats.org/drawingml/2006/picture">
+                <pic:pic xmlns:pic="http://schemas.openxmlformats.org/drawingml/2006/picture">
+                  <pic:nvPicPr>
+                    <pic:cNvPr id="1217037513" name=""/>
+                    <pic:cNvPicPr/>
+                  </pic:nvPicPr>
+                  <pic:blipFill>
+                    <a:blip r:embed="rId139"/>
+                    <a:stretch>
+                      <a:fillRect/>
+                    </a:stretch>
+                  </pic:blipFill>
+                  <pic:spPr>
+                    <a:xfrm>
+                      <a:off x="0" y="0"/>
+                      <a:ext cx="1248264" cy="1098771"/>
+                    </a:xfrm>
+                    <a:prstGeom prst="rect">
+                      <a:avLst/>
+                    </a:prstGeom>
+                  </pic:spPr>
+                </pic:pic>
+              </a:graphicData>
+            </a:graphic>
+          </wp:inline>
+        </w:drawing>
+      </w:r>
+    </w:p>
+    <w:p>
+      <w:pPr>
+        <w:rPr>
+          <w:sz w:val="28"/>
+          <w:szCs w:val="28"/>
+          <w:lang w:val="fr-FR"/>
+        </w:rPr>
+      </w:pPr>
+      <w:r>
+        <w:rPr>
+          <w:sz w:val="28"/>
+          <w:szCs w:val="28"/>
+          <w:lang w:val="fr-FR"/>
+        </w:rPr>
+        <w:drawing>
+          <wp:inline distT="0" distB="0" distL="0" distR="0" wp14:anchorId="4DA94AC7" wp14:editId="0F982277">
+            <wp:extent cx="6004798" cy="1329267"/>
+            <wp:effectExtent l="0" t="0" r="0" b="4445"/>
+            <wp:docPr id="872763469" name="Picture 1"/>
+            <wp:cNvGraphicFramePr>
+              <a:graphicFrameLocks xmlns:a="http://schemas.openxmlformats.org/drawingml/2006/main" noChangeAspect="1"/>
+            </wp:cNvGraphicFramePr>
+            <a:graphic xmlns:a="http://schemas.openxmlformats.org/drawingml/2006/main">
+              <a:graphicData uri="http://schemas.openxmlformats.org/drawingml/2006/picture">
+                <pic:pic xmlns:pic="http://schemas.openxmlformats.org/drawingml/2006/picture">
+                  <pic:nvPicPr>
+                    <pic:cNvPr id="872763469" name=""/>
+                    <pic:cNvPicPr/>
+                  </pic:nvPicPr>
+                  <pic:blipFill>
+                    <a:blip r:embed="rId140"/>
+                    <a:stretch>
+                      <a:fillRect/>
+                    </a:stretch>
+                  </pic:blipFill>
+                  <pic:spPr>
+                    <a:xfrm>
+                      <a:off x="0" y="0"/>
+                      <a:ext cx="6021135" cy="1332884"/>
+                    </a:xfrm>
+                    <a:prstGeom prst="rect">
+                      <a:avLst/>
+                    </a:prstGeom>
+                  </pic:spPr>
+                </pic:pic>
+              </a:graphicData>
+            </a:graphic>
+          </wp:inline>
+        </w:drawing>
+      </w:r>
+    </w:p>
+    <w:p>
+      <w:pPr>
+        <w:rPr>
+          <w:sz w:val="28"/>
+          <w:szCs w:val="28"/>
+        </w:rPr>
+      </w:pPr>
+      <w:r>
+        <w:rPr>
+          <w:sz w:val="28"/>
+          <w:szCs w:val="28"/>
+        </w:rPr>
+        <w:lastRenderedPageBreak/>
+        <w:t>Calculate the Std Dev of</w:t>
+      </w:r>
+      <w:r>
+        <w:rPr>
+          <w:sz w:val="28"/>
+          <w:szCs w:val="28"/>
+        </w:rPr>
+        <w:t xml:space="preserve"> the residual column.</w:t>
+      </w:r>
+    </w:p>
+    <w:p>
+      <w:pPr>
+        <w:rPr>
+          <w:sz w:val="28"/>
+          <w:szCs w:val="28"/>
+        </w:rPr>
+      </w:pPr>
+      <w:r>
+        <w:rPr>
+          <w:sz w:val="28"/>
+          <w:szCs w:val="28"/>
+        </w:rPr>
+        <w:drawing>
+          <wp:inline distT="0" distB="0" distL="0" distR="0" wp14:anchorId="235B9BFA" wp14:editId="50E94B10">
+            <wp:extent cx="4021667" cy="1444277"/>
+            <wp:effectExtent l="0" t="0" r="0" b="3810"/>
+            <wp:docPr id="1229829284" name="Picture 1"/>
+            <wp:cNvGraphicFramePr>
+              <a:graphicFrameLocks xmlns:a="http://schemas.openxmlformats.org/drawingml/2006/main" noChangeAspect="1"/>
+            </wp:cNvGraphicFramePr>
+            <a:graphic xmlns:a="http://schemas.openxmlformats.org/drawingml/2006/main">
+              <a:graphicData uri="http://schemas.openxmlformats.org/drawingml/2006/picture">
+                <pic:pic xmlns:pic="http://schemas.openxmlformats.org/drawingml/2006/picture">
+                  <pic:nvPicPr>
+                    <pic:cNvPr id="1229829284" name=""/>
+                    <pic:cNvPicPr/>
+                  </pic:nvPicPr>
+                  <pic:blipFill>
+                    <a:blip r:embed="rId141"/>
+                    <a:stretch>
+                      <a:fillRect/>
+                    </a:stretch>
+                  </pic:blipFill>
+                  <pic:spPr>
+                    <a:xfrm>
+                      <a:off x="0" y="0"/>
+                      <a:ext cx="4036857" cy="1449732"/>
+                    </a:xfrm>
+                    <a:prstGeom prst="rect">
+                      <a:avLst/>
+                    </a:prstGeom>
+                  </pic:spPr>
+                </pic:pic>
+              </a:graphicData>
+            </a:graphic>
+          </wp:inline>
+        </w:drawing>
+      </w:r>
+    </w:p>
+    <w:p>
+      <w:pPr>
+        <w:rPr>
+          <w:sz w:val="28"/>
+          <w:szCs w:val="28"/>
+        </w:rPr>
+      </w:pPr>
+    </w:p>
+    <w:p>
+      <w:pPr>
+        <w:rPr>
+          <w:sz w:val="28"/>
+          <w:szCs w:val="28"/>
+        </w:rPr>
+      </w:pPr>
+      <w:r>
+        <w:rPr>
+          <w:sz w:val="28"/>
+          <w:szCs w:val="28"/>
+        </w:rPr>
+        <w:t xml:space="preserve">Plot the </w:t>
+      </w:r>
+      <w:r>
+        <w:rPr>
+          <w:sz w:val="28"/>
+          <w:szCs w:val="28"/>
+        </w:rPr>
+        <w:t>Δ</w:t>
+      </w:r>
+      <w:r>
+        <w:rPr>
+          <w:sz w:val="28"/>
+          <w:szCs w:val="28"/>
+        </w:rPr>
+        <w:t>K(t)</w:t>
+      </w:r>
+      <w:r>
+        <w:rPr>
+          <w:sz w:val="28"/>
+          <w:szCs w:val="28"/>
+        </w:rPr>
+        <w:t>s</w:t>
+      </w:r>
+      <w:r>
+        <w:rPr>
+          <w:sz w:val="28"/>
+          <w:szCs w:val="28"/>
+        </w:rPr>
+        <w:t>.</w:t>
+      </w:r>
+    </w:p>
+    <w:p>
+      <w:pPr>
+        <w:rPr>
+          <w:sz w:val="28"/>
+          <w:szCs w:val="28"/>
+        </w:rPr>
+      </w:pPr>
+      <w:r>
+        <w:rPr>
+          <w:sz w:val="28"/>
+          <w:szCs w:val="28"/>
+        </w:rPr>
+        <w:drawing>
+          <wp:inline distT="0" distB="0" distL="0" distR="0" wp14:anchorId="38F11A38" wp14:editId="45B6FE6E">
+            <wp:extent cx="4402667" cy="2489923"/>
+            <wp:effectExtent l="0" t="0" r="0" b="5715"/>
+            <wp:docPr id="585697778" name="Picture 1"/>
+            <wp:cNvGraphicFramePr>
+              <a:graphicFrameLocks xmlns:a="http://schemas.openxmlformats.org/drawingml/2006/main" noChangeAspect="1"/>
+            </wp:cNvGraphicFramePr>
+            <a:graphic xmlns:a="http://schemas.openxmlformats.org/drawingml/2006/main">
+              <a:graphicData uri="http://schemas.openxmlformats.org/drawingml/2006/picture">
+                <pic:pic xmlns:pic="http://schemas.openxmlformats.org/drawingml/2006/picture">
+                  <pic:nvPicPr>
+                    <pic:cNvPr id="585697778" name=""/>
+                    <pic:cNvPicPr/>
+                  </pic:nvPicPr>
+                  <pic:blipFill>
+                    <a:blip r:embed="rId142"/>
+                    <a:stretch>
+                      <a:fillRect/>
+                    </a:stretch>
+                  </pic:blipFill>
+                  <pic:spPr>
+                    <a:xfrm>
+                      <a:off x="0" y="0"/>
+                      <a:ext cx="4408100" cy="2492996"/>
+                    </a:xfrm>
+                    <a:prstGeom prst="rect">
+                      <a:avLst/>
+                    </a:prstGeom>
+                  </pic:spPr>
+                </pic:pic>
+              </a:graphicData>
+            </a:graphic>
+          </wp:inline>
+        </w:drawing>
+      </w:r>
+    </w:p>
+    <w:p>
+      <w:pPr>
+        <w:rPr>
+          <w:sz w:val="28"/>
+          <w:szCs w:val="28"/>
+        </w:rPr>
+      </w:pPr>
+    </w:p>
+    <w:p>
+      <w:pPr>
+        <w:rPr>
+          <w:sz w:val="28"/>
+          <w:szCs w:val="28"/>
+        </w:rPr>
+      </w:pPr>
+      <w:r>
+        <w:rPr>
+          <w:sz w:val="28"/>
+          <w:szCs w:val="28"/>
+        </w:rPr>
+        <w:t>Forecast the future K(t)s with</w:t>
+      </w:r>
+      <w:r>
+        <w:rPr>
+          <w:sz w:val="28"/>
+          <w:szCs w:val="28"/>
+        </w:rPr>
+        <w:t xml:space="preserve"> this formula K</w:t>
+      </w:r>
+      <w:r>
+        <w:rPr>
+          <w:sz w:val="28"/>
+          <w:szCs w:val="28"/>
+        </w:rPr>
+        <w:t>(t*) = drift + K(t-1)</w:t>
+      </w:r>
+      <w:r>
+        <w:rPr>
+          <w:sz w:val="28"/>
+          <w:szCs w:val="28"/>
+        </w:rPr>
+        <w:t>.</w:t>
+      </w:r>
+    </w:p>
+    <w:p>
+      <w:pPr>
+        <w:rPr>
+          <w:sz w:val="28"/>
+          <w:szCs w:val="28"/>
+        </w:rPr>
+      </w:pPr>
+      <w:r>
+        <w:rPr>
+          <w:sz w:val="28"/>
+          <w:szCs w:val="28"/>
+        </w:rPr>
+        <w:drawing>
+          <wp:inline distT="0" distB="0" distL="0" distR="0" wp14:anchorId="57C5AC01" wp14:editId="65D92D44">
+            <wp:extent cx="3420533" cy="2107469"/>
+            <wp:effectExtent l="0" t="0" r="8890" b="7620"/>
+            <wp:docPr id="157525523" name="Picture 1"/>
+            <wp:cNvGraphicFramePr>
+              <a:graphicFrameLocks xmlns:a="http://schemas.openxmlformats.org/drawingml/2006/main" noChangeAspect="1"/>
+            </wp:cNvGraphicFramePr>
+            <a:graphic xmlns:a="http://schemas.openxmlformats.org/drawingml/2006/main">
+              <a:graphicData uri="http://schemas.openxmlformats.org/drawingml/2006/picture">
+                <pic:pic xmlns:pic="http://schemas.openxmlformats.org/drawingml/2006/picture">
+                  <pic:nvPicPr>
+                    <pic:cNvPr id="157525523" name=""/>
+                    <pic:cNvPicPr/>
+                  </pic:nvPicPr>
+                  <pic:blipFill>
+                    <a:blip r:embed="rId143"/>
+                    <a:stretch>
+                      <a:fillRect/>
+                    </a:stretch>
+                  </pic:blipFill>
+                  <pic:spPr>
+                    <a:xfrm>
+                      <a:off x="0" y="0"/>
+                      <a:ext cx="3423585" cy="2109349"/>
+                    </a:xfrm>
+                    <a:prstGeom prst="rect">
+                      <a:avLst/>
+                    </a:prstGeom>
+                  </pic:spPr>
+                </pic:pic>
+              </a:graphicData>
+            </a:graphic>
+          </wp:inline>
+        </w:drawing>
+      </w:r>
+    </w:p>
+    <w:p>
+      <w:pPr>
+        <w:rPr>
+          <w:sz w:val="28"/>
+          <w:szCs w:val="28"/>
+        </w:rPr>
+      </w:pPr>
+      <w:r>
+        <w:rPr>
+          <w:sz w:val="28"/>
+          <w:szCs w:val="28"/>
+        </w:rPr>
+        <w:lastRenderedPageBreak/>
+        <w:drawing>
+          <wp:inline distT="0" distB="0" distL="0" distR="0" wp14:anchorId="76204ADD" wp14:editId="48602E6E">
+            <wp:extent cx="3589867" cy="2159318"/>
+            <wp:effectExtent l="0" t="0" r="0" b="0"/>
+            <wp:docPr id="1135211028" name="Picture 1"/>
+            <wp:cNvGraphicFramePr>
+              <a:graphicFrameLocks xmlns:a="http://schemas.openxmlformats.org/drawingml/2006/main" noChangeAspect="1"/>
+            </wp:cNvGraphicFramePr>
+            <a:graphic xmlns:a="http://schemas.openxmlformats.org/drawingml/2006/main">
+              <a:graphicData uri="http://schemas.openxmlformats.org/drawingml/2006/picture">
+                <pic:pic xmlns:pic="http://schemas.openxmlformats.org/drawingml/2006/picture">
+                  <pic:nvPicPr>
+                    <pic:cNvPr id="1135211028" name=""/>
+                    <pic:cNvPicPr/>
+                  </pic:nvPicPr>
+                  <pic:blipFill>
+                    <a:blip r:embed="rId144"/>
+                    <a:stretch>
+                      <a:fillRect/>
+                    </a:stretch>
+                  </pic:blipFill>
+                  <pic:spPr>
+                    <a:xfrm>
+                      <a:off x="0" y="0"/>
+                      <a:ext cx="3597996" cy="2164208"/>
+                    </a:xfrm>
+                    <a:prstGeom prst="rect">
+                      <a:avLst/>
+                    </a:prstGeom>
+                  </pic:spPr>
+                </pic:pic>
+              </a:graphicData>
+            </a:graphic>
+          </wp:inline>
+        </w:drawing>
+      </w:r>
+    </w:p>
+    <w:p>
+      <w:pPr>
+        <w:rPr>
+          <w:sz w:val="28"/>
+          <w:szCs w:val="28"/>
+        </w:rPr>
+      </w:pPr>
+      <w:r>
+        <w:rPr>
+          <w:sz w:val="28"/>
+          <w:szCs w:val="28"/>
+        </w:rPr>
+        <w:t>…</w:t>
+      </w:r>
+    </w:p>
+    <w:p>
+      <w:pPr>
+        <w:rPr>
+          <w:sz w:val="28"/>
+          <w:szCs w:val="28"/>
+        </w:rPr>
+      </w:pPr>
+    </w:p>
+    <w:p>
+      <w:pPr>
+        <w:rPr>
+          <w:sz w:val="28"/>
+          <w:szCs w:val="28"/>
+        </w:rPr>
+      </w:pPr>
+      <w:r>
+        <w:rPr>
+          <w:sz w:val="28"/>
+          <w:szCs w:val="28"/>
+        </w:rPr>
+        <w:t>Set horizon</w:t>
+      </w:r>
+      <w:r>
+        <w:rPr>
+          <w:sz w:val="28"/>
+          <w:szCs w:val="28"/>
+        </w:rPr>
+        <w:t xml:space="preserve"> term h</w:t>
+      </w:r>
+    </w:p>
+    <w:p>
+      <w:pPr>
+        <w:rPr>
+          <w:sz w:val="28"/>
+          <w:szCs w:val="28"/>
+        </w:rPr>
+      </w:pPr>
+      <w:r>
+        <w:rPr>
+          <w:sz w:val="28"/>
+          <w:szCs w:val="28"/>
+        </w:rPr>
+        <w:drawing>
+          <wp:inline distT="0" distB="0" distL="0" distR="0" wp14:anchorId="2BA1056C" wp14:editId="57B758A3">
+            <wp:extent cx="1642533" cy="998660"/>
+            <wp:effectExtent l="0" t="0" r="0" b="0"/>
+            <wp:docPr id="1853148565" name="Picture 1"/>
+            <wp:cNvGraphicFramePr>
+              <a:graphicFrameLocks xmlns:a="http://schemas.openxmlformats.org/drawingml/2006/main" noChangeAspect="1"/>
+            </wp:cNvGraphicFramePr>
+            <a:graphic xmlns:a="http://schemas.openxmlformats.org/drawingml/2006/main">
+              <a:graphicData uri="http://schemas.openxmlformats.org/drawingml/2006/picture">
+                <pic:pic xmlns:pic="http://schemas.openxmlformats.org/drawingml/2006/picture">
+                  <pic:nvPicPr>
+                    <pic:cNvPr id="1853148565" name=""/>
+                    <pic:cNvPicPr/>
+                  </pic:nvPicPr>
+                  <pic:blipFill>
+                    <a:blip r:embed="rId145"/>
+                    <a:stretch>
+                      <a:fillRect/>
+                    </a:stretch>
+                  </pic:blipFill>
+                  <pic:spPr>
+                    <a:xfrm>
+                      <a:off x="0" y="0"/>
+                      <a:ext cx="1647254" cy="1001530"/>
+                    </a:xfrm>
+                    <a:prstGeom prst="rect">
+                      <a:avLst/>
+                    </a:prstGeom>
+                  </pic:spPr>
+                </pic:pic>
+              </a:graphicData>
+            </a:graphic>
+          </wp:inline>
+        </w:drawing>
+      </w:r>
+    </w:p>
+    <w:p>
+      <w:pPr>
+        <w:rPr>
+          <w:sz w:val="28"/>
+          <w:szCs w:val="28"/>
+        </w:rPr>
+      </w:pPr>
+    </w:p>
+    <w:p>
+      <w:pPr>
+        <w:rPr>
+          <w:sz w:val="28"/>
+          <w:szCs w:val="28"/>
+        </w:rPr>
+      </w:pPr>
+      <w:r>
+        <w:rPr>
+          <w:sz w:val="28"/>
+          <w:szCs w:val="28"/>
+        </w:rPr>
+        <w:t>Calculate</w:t>
+      </w:r>
+      <w:r>
+        <w:rPr>
+          <w:sz w:val="28"/>
+          <w:szCs w:val="28"/>
+        </w:rPr>
+        <w:t xml:space="preserve"> 95% confidence</w:t>
+      </w:r>
+      <w:r>
+        <w:rPr>
+          <w:sz w:val="28"/>
+          <w:szCs w:val="28"/>
+        </w:rPr>
+        <w:t xml:space="preserve"> lower and </w:t>
+      </w:r>
+      <w:r>
+        <w:rPr>
+          <w:sz w:val="28"/>
+          <w:szCs w:val="28"/>
+        </w:rPr>
+        <w:t xml:space="preserve">upper bounds of the forecast values using </w:t>
+      </w:r>
+      <w:r>
+        <w:rPr>
+          <w:sz w:val="28"/>
+          <w:szCs w:val="28"/>
+        </w:rPr>
+        <w:t>the formula be</w:t>
+      </w:r>
+      <w:r>
+        <w:rPr>
+          <w:sz w:val="28"/>
+          <w:szCs w:val="28"/>
+        </w:rPr>
+        <w:t>low. Formula is essentially value</w:t>
+      </w:r>
+      <w:r>
+        <w:rPr>
+          <w:sz w:val="28"/>
+          <w:szCs w:val="28"/>
+        </w:rPr>
+        <w:t xml:space="preserve"> (+ or -) 1.96</w:t>
+      </w:r>
+      <w:r>
+        <w:rPr>
+          <w:sz w:val="28"/>
+          <w:szCs w:val="28"/>
+        </w:rPr>
+        <w:t>*SQRT(h)*StdDev</w:t>
+      </w:r>
+      <w:r>
+        <w:rPr>
+          <w:sz w:val="28"/>
+          <w:szCs w:val="28"/>
+        </w:rPr>
+        <w:t>.</w:t>
+      </w:r>
+    </w:p>
+    <w:p>
+      <w:pPr>
+        <w:rPr>
+          <w:sz w:val="28"/>
+          <w:szCs w:val="28"/>
+        </w:rPr>
+      </w:pPr>
+      <w:r>
+        <w:rPr>
+          <w:sz w:val="28"/>
+          <w:szCs w:val="28"/>
+        </w:rPr>
+        <w:drawing>
+          <wp:inline distT="0" distB="0" distL="0" distR="0" wp14:anchorId="253857BF" wp14:editId="74EE03FA">
+            <wp:extent cx="3623733" cy="1055734"/>
+            <wp:effectExtent l="0" t="0" r="0" b="0"/>
+            <wp:docPr id="598484230" name="Picture 1"/>
+            <wp:cNvGraphicFramePr>
+              <a:graphicFrameLocks xmlns:a="http://schemas.openxmlformats.org/drawingml/2006/main" noChangeAspect="1"/>
+            </wp:cNvGraphicFramePr>
+            <a:graphic xmlns:a="http://schemas.openxmlformats.org/drawingml/2006/main">
+              <a:graphicData uri="http://schemas.openxmlformats.org/drawingml/2006/picture">
+                <pic:pic xmlns:pic="http://schemas.openxmlformats.org/drawingml/2006/picture">
+                  <pic:nvPicPr>
+                    <pic:cNvPr id="598484230" name=""/>
+                    <pic:cNvPicPr/>
+                  </pic:nvPicPr>
+                  <pic:blipFill>
+                    <a:blip r:embed="rId146"/>
+                    <a:stretch>
+                      <a:fillRect/>
+                    </a:stretch>
+                  </pic:blipFill>
+                  <pic:spPr>
+                    <a:xfrm>
+                      <a:off x="0" y="0"/>
+                      <a:ext cx="3628341" cy="1057076"/>
+                    </a:xfrm>
+                    <a:prstGeom prst="rect">
+                      <a:avLst/>
+                    </a:prstGeom>
+                  </pic:spPr>
+                </pic:pic>
+              </a:graphicData>
+            </a:graphic>
+          </wp:inline>
+        </w:drawing>
+      </w:r>
+    </w:p>
+    <w:p>
+      <w:pPr>
+        <w:rPr>
+          <w:sz w:val="28"/>
+          <w:szCs w:val="28"/>
+        </w:rPr>
+      </w:pPr>
+      <w:r>
+        <w:rPr>
+          <w:sz w:val="28"/>
+          <w:szCs w:val="28"/>
+        </w:rPr>
+        <w:drawing>
+          <wp:inline distT="0" distB="0" distL="0" distR="0" wp14:anchorId="6EB266A9" wp14:editId="2CC29172">
+            <wp:extent cx="4280513" cy="1041400"/>
+            <wp:effectExtent l="0" t="0" r="6350" b="6350"/>
+            <wp:docPr id="678583187" name="Picture 1"/>
+            <wp:cNvGraphicFramePr>
+              <a:graphicFrameLocks xmlns:a="http://schemas.openxmlformats.org/drawingml/2006/main" noChangeAspect="1"/>
+            </wp:cNvGraphicFramePr>
+            <a:graphic xmlns:a="http://schemas.openxmlformats.org/drawingml/2006/main">
+              <a:graphicData uri="http://schemas.openxmlformats.org/drawingml/2006/picture">
+                <pic:pic xmlns:pic="http://schemas.openxmlformats.org/drawingml/2006/picture">
+                  <pic:nvPicPr>
+                    <pic:cNvPr id="678583187" name=""/>
+                    <pic:cNvPicPr/>
+                  </pic:nvPicPr>
+                  <pic:blipFill>
+                    <a:blip r:embed="rId147"/>
+                    <a:stretch>
+                      <a:fillRect/>
+                    </a:stretch>
+                  </pic:blipFill>
+                  <pic:spPr>
+                    <a:xfrm>
+                      <a:off x="0" y="0"/>
+                      <a:ext cx="4299717" cy="1046072"/>
+                    </a:xfrm>
+                    <a:prstGeom prst="rect">
+                      <a:avLst/>
+                    </a:prstGeom>
+                  </pic:spPr>
+                </pic:pic>
+              </a:graphicData>
+            </a:graphic>
+          </wp:inline>
+        </w:drawing>
+      </w:r>
+    </w:p>
+    <w:p>
+      <w:pPr>
+        <w:rPr>
+          <w:sz w:val="28"/>
+          <w:szCs w:val="28"/>
+        </w:rPr>
+      </w:pPr>
+      <w:r>
+        <w:rPr>
+          <w:sz w:val="28"/>
+          <w:szCs w:val="28"/>
+        </w:rPr>
+        <w:lastRenderedPageBreak/>
+        <w:t>Plot the Forecasted K(t) and the upper and lower bounds.</w:t>
+      </w:r>
+    </w:p>
+    <w:p>
+      <w:pPr>
+        <w:rPr>
+          <w:sz w:val="28"/>
+          <w:szCs w:val="28"/>
+        </w:rPr>
+      </w:pPr>
+      <w:r>
+        <w:rPr>
+          <w:sz w:val="28"/>
+          <w:szCs w:val="28"/>
+        </w:rPr>
+        <w:drawing>
+          <wp:inline distT="0" distB="0" distL="0" distR="0" wp14:anchorId="40874790" wp14:editId="20D139E7">
+            <wp:extent cx="4930567" cy="2911092"/>
+            <wp:effectExtent l="0" t="0" r="3810" b="3810"/>
+            <wp:docPr id="1222791751" name="Picture 1"/>
+            <wp:cNvGraphicFramePr>
+              <a:graphicFrameLocks xmlns:a="http://schemas.openxmlformats.org/drawingml/2006/main" noChangeAspect="1"/>
+            </wp:cNvGraphicFramePr>
+            <a:graphic xmlns:a="http://schemas.openxmlformats.org/drawingml/2006/main">
+              <a:graphicData uri="http://schemas.openxmlformats.org/drawingml/2006/picture">
+                <pic:pic xmlns:pic="http://schemas.openxmlformats.org/drawingml/2006/picture">
+                  <pic:nvPicPr>
+                    <pic:cNvPr id="1222791751" name=""/>
+                    <pic:cNvPicPr/>
+                  </pic:nvPicPr>
+                  <pic:blipFill>
+                    <a:blip r:embed="rId148"/>
+                    <a:stretch>
+                      <a:fillRect/>
+                    </a:stretch>
+                  </pic:blipFill>
+                  <pic:spPr>
+                    <a:xfrm>
+                      <a:off x="0" y="0"/>
+                      <a:ext cx="4930567" cy="2911092"/>
+                    </a:xfrm>
+                    <a:prstGeom prst="rect">
+                      <a:avLst/>
+                    </a:prstGeom>
+                  </pic:spPr>
+                </pic:pic>
+              </a:graphicData>
+            </a:graphic>
+          </wp:inline>
+        </w:drawing>
+      </w:r>
+    </w:p>
+    <w:p>
+      <w:pPr>
+        <w:rPr>
+          <w:sz w:val="28"/>
+          <w:szCs w:val="28"/>
+        </w:rPr>
+      </w:pPr>
+    </w:p>
+    <w:p>
+      <w:pPr>
+        <w:rPr>
+          <w:sz w:val="28"/>
+          <w:szCs w:val="28"/>
+        </w:rPr>
+      </w:pPr>
+      <w:r>
+        <w:rPr>
+          <w:sz w:val="28"/>
+          <w:szCs w:val="28"/>
+        </w:rPr>
+        <w:t xml:space="preserve">We can use the predicted K(2021*) and </w:t>
+      </w:r>
+      <w:r>
+        <w:rPr>
+          <w:sz w:val="28"/>
+          <w:szCs w:val="28"/>
+        </w:rPr>
+        <w:t>our stationary b(x) to</w:t>
+      </w:r>
+      <w:r>
+        <w:rPr>
+          <w:sz w:val="28"/>
+          <w:szCs w:val="28"/>
+        </w:rPr>
+        <w:t xml:space="preserve"> revert to m(x) to</w:t>
+      </w:r>
+      <w:r>
+        <w:rPr>
+          <w:sz w:val="28"/>
+          <w:szCs w:val="28"/>
+        </w:rPr>
+        <w:t xml:space="preserve"> forecast mortalities for 2021. </w:t>
+      </w:r>
+      <w:r>
+        <w:rPr>
+          <w:sz w:val="28"/>
+          <w:szCs w:val="28"/>
+        </w:rPr>
+        <w:t>We will do this in python since it excel is not efficient in effectively modeling large amount of calculations + modeling + automated.</w:t>
       </w:r>
     </w:p>
     <w:p>

</xml_diff>